<commit_message>
lots of progress on ms draft!
</commit_message>
<xml_diff>
--- a/Publication docs/Lim_meta_analysis.docx
+++ b/Publication docs/Lim_meta_analysis.docx
@@ -4423,17 +4423,31 @@
         </w:rPr>
         <w:t xml:space="preserve"> </w:t>
       </w:r>
-      <w:r>
-        <w:rPr>
-          <w:rFonts w:ascii="Times New Roman" w:hAnsi="Times New Roman" w:cs="Times New Roman"/>
-        </w:rPr>
-        <w:t>38</w:t>
+      <w:commentRangeStart w:id="8"/>
+      <w:r>
+        <w:rPr>
+          <w:rFonts w:ascii="Times New Roman" w:hAnsi="Times New Roman" w:cs="Times New Roman"/>
+        </w:rPr>
+        <w:t>3</w:t>
+      </w:r>
+      <w:r>
+        <w:rPr>
+          <w:rFonts w:ascii="Times New Roman" w:hAnsi="Times New Roman" w:cs="Times New Roman"/>
+        </w:rPr>
+        <w:t>7</w:t>
       </w:r>
       <w:r>
         <w:rPr>
           <w:rFonts w:ascii="Times New Roman" w:hAnsi="Times New Roman" w:cs="Times New Roman"/>
         </w:rPr>
         <w:t xml:space="preserve"> </w:t>
+      </w:r>
+      <w:commentRangeEnd w:id="8"/>
+      <w:r>
+        <w:rPr>
+          <w:rStyle w:val="CommentReference"/>
+        </w:rPr>
+        <w:commentReference w:id="8"/>
       </w:r>
       <w:r>
         <w:rPr>
@@ -4658,19 +4672,7 @@
         <w:rPr>
           <w:rFonts w:ascii="Times New Roman" w:hAnsi="Times New Roman" w:cs="Times New Roman"/>
         </w:rPr>
-        <w:t>We standardized the continuous moderators</w:t>
-      </w:r>
-      <w:r>
-        <w:rPr>
-          <w:rFonts w:ascii="Times New Roman" w:hAnsi="Times New Roman" w:cs="Times New Roman"/>
-        </w:rPr>
-        <w:t xml:space="preserve"> (absolute latitude, temperature, and background nutrients)</w:t>
-      </w:r>
-      <w:r>
-        <w:rPr>
-          <w:rFonts w:ascii="Times New Roman" w:hAnsi="Times New Roman" w:cs="Times New Roman"/>
-        </w:rPr>
-        <w:t xml:space="preserve"> in the models. </w:t>
+        <w:t xml:space="preserve">We standardized the continuous moderators (absolute latitude, temperature, and background nutrients) in the models. </w:t>
       </w:r>
       <w:r>
         <w:rPr>
@@ -4696,31 +4698,87 @@
         </w:rPr>
         <w:t xml:space="preserve">on a scale of 1-5; (1) Field: natural experiment, (2) Field: primary producer manipulated, (3) Field: animal stocked, (4) Field: both primary producer and animals stocked, and (5) Lab: mesocosm experiment. </w:t>
       </w:r>
-      <w:commentRangeStart w:id="8"/>
+      <w:commentRangeStart w:id="9"/>
       <w:r>
         <w:rPr>
           <w:rFonts w:ascii="Times New Roman" w:hAnsi="Times New Roman" w:cs="Times New Roman"/>
         </w:rPr>
         <w:t>Primary producers were grouped</w:t>
       </w:r>
-      <w:commentRangeEnd w:id="8"/>
+      <w:commentRangeEnd w:id="9"/>
       <w:r>
         <w:rPr>
           <w:rStyle w:val="CommentReference"/>
         </w:rPr>
-        <w:commentReference w:id="8"/>
-      </w:r>
-      <w:r>
-        <w:rPr>
-          <w:rFonts w:ascii="Times New Roman" w:hAnsi="Times New Roman" w:cs="Times New Roman"/>
-        </w:rPr>
-        <w:t xml:space="preserve"> into either (1) Algae, (2) Coral, (3) Phytoplankton, or (4) Vascular plant. </w:t>
-      </w:r>
-      <w:r>
-        <w:rPr>
-          <w:rFonts w:ascii="Times New Roman" w:hAnsi="Times New Roman" w:cs="Times New Roman"/>
-        </w:rPr>
-        <w:t xml:space="preserve">We also collected data quantifying the level of provisioning by animals to primary producers, but this information was unavailable for the majority of studies.  </w:t>
+        <w:commentReference w:id="9"/>
+      </w:r>
+      <w:r>
+        <w:rPr>
+          <w:rFonts w:ascii="Times New Roman" w:hAnsi="Times New Roman" w:cs="Times New Roman"/>
+        </w:rPr>
+        <w:t xml:space="preserve"> into either (1) Algae, (2) Coral, (3) Phytoplankton, or (4) Vascular plant</w:t>
+      </w:r>
+      <w:r>
+        <w:rPr>
+          <w:rFonts w:ascii="Times New Roman" w:hAnsi="Times New Roman" w:cs="Times New Roman"/>
+        </w:rPr>
+        <w:t>s</w:t>
+      </w:r>
+      <w:r>
+        <w:rPr>
+          <w:rFonts w:ascii="Times New Roman" w:hAnsi="Times New Roman" w:cs="Times New Roman"/>
+        </w:rPr>
+        <w:t xml:space="preserve">. </w:t>
+      </w:r>
+      <w:r>
+        <w:rPr>
+          <w:rFonts w:ascii="Times New Roman" w:hAnsi="Times New Roman" w:cs="Times New Roman"/>
+        </w:rPr>
+        <w:t>We considered considering grouping primary producers into finer levels (</w:t>
+      </w:r>
+      <w:proofErr w:type="spellStart"/>
+      <w:r>
+        <w:rPr>
+          <w:rFonts w:ascii="Times New Roman" w:hAnsi="Times New Roman" w:cs="Times New Roman"/>
+        </w:rPr>
+        <w:t>eg.</w:t>
+      </w:r>
+      <w:proofErr w:type="spellEnd"/>
+      <w:r>
+        <w:rPr>
+          <w:rFonts w:ascii="Times New Roman" w:hAnsi="Times New Roman" w:cs="Times New Roman"/>
+        </w:rPr>
+        <w:t xml:space="preserve"> splitting fleshy and crustose algae, or seagrass and mangroves) but preliminary models </w:t>
+      </w:r>
+      <w:r>
+        <w:rPr>
+          <w:rFonts w:ascii="Times New Roman" w:hAnsi="Times New Roman" w:cs="Times New Roman"/>
+        </w:rPr>
+        <w:t>with these finer groupings did not improve fit, and we did</w:t>
+      </w:r>
+      <w:r>
+        <w:rPr>
+          <w:rFonts w:ascii="Times New Roman" w:hAnsi="Times New Roman" w:cs="Times New Roman"/>
+        </w:rPr>
+        <w:t xml:space="preserve"> not detect significant differences between finer groups within our chosen broader categories. </w:t>
+      </w:r>
+      <w:r>
+        <w:rPr>
+          <w:rFonts w:ascii="Times New Roman" w:hAnsi="Times New Roman" w:cs="Times New Roman"/>
+        </w:rPr>
+        <w:t>We also collected data quantifying the level of provisioning by animals to primary producers, but this information was unavailable for the majority of studies</w:t>
+      </w:r>
+      <w:r>
+        <w:rPr>
+          <w:rFonts w:ascii="Times New Roman" w:hAnsi="Times New Roman" w:cs="Times New Roman"/>
+        </w:rPr>
+        <w:t xml:space="preserve"> and inclusion did not improve our models, so we did not consider this factor in final models</w:t>
+      </w:r>
+      <w:r>
+        <w:rPr>
+          <w:rFonts w:ascii="Times New Roman" w:hAnsi="Times New Roman" w:cs="Times New Roman"/>
+        </w:rPr>
+        <w:t xml:space="preserve">.  </w:t>
       </w:r>
     </w:p>
     <w:p>
@@ -5104,7 +5162,15 @@
           <w:rFonts w:ascii="Times New Roman" w:hAnsi="Times New Roman" w:cs="Times New Roman"/>
           <w:noProof/>
         </w:rPr>
-        <w:t>(Viechtbauer, 2010)</w:t>
+        <w:t xml:space="preserve">(Viechtbauer, </w:t>
+      </w:r>
+      <w:r>
+        <w:rPr>
+          <w:rFonts w:ascii="Times New Roman" w:hAnsi="Times New Roman" w:cs="Times New Roman"/>
+          <w:noProof/>
+        </w:rPr>
+        <w:lastRenderedPageBreak/>
+        <w:t>2010)</w:t>
       </w:r>
       <w:r>
         <w:rPr>
@@ -5124,7 +5190,7 @@
         </w:rPr>
         <w:t xml:space="preserve">We used the restricted maximum likelihood estimator to estimate residual heterogeneity and used </w:t>
       </w:r>
-      <w:commentRangeStart w:id="9"/>
+      <w:commentRangeStart w:id="10"/>
       <w:r>
         <w:rPr>
           <w:rFonts w:ascii="Times New Roman" w:hAnsi="Times New Roman" w:cs="Times New Roman"/>
@@ -5137,12 +5203,12 @@
         </w:rPr>
         <w:t xml:space="preserve"> </w:t>
       </w:r>
-      <w:commentRangeEnd w:id="9"/>
+      <w:commentRangeEnd w:id="10"/>
       <w:r>
         <w:rPr>
           <w:rStyle w:val="CommentReference"/>
         </w:rPr>
-        <w:commentReference w:id="9"/>
+        <w:commentReference w:id="10"/>
       </w:r>
       <w:r>
         <w:rPr>
@@ -5173,6 +5239,1285 @@
           <w:rFonts w:ascii="Times New Roman" w:hAnsi="Times New Roman" w:cs="Times New Roman"/>
         </w:rPr>
         <w:t>.</w:t>
+      </w:r>
+      <w:r>
+        <w:rPr>
+          <w:rFonts w:ascii="Times New Roman" w:hAnsi="Times New Roman" w:cs="Times New Roman"/>
+        </w:rPr>
+        <w:t xml:space="preserve"> </w:t>
+      </w:r>
+      <w:r>
+        <w:rPr>
+          <w:rFonts w:ascii="Times New Roman" w:hAnsi="Times New Roman" w:cs="Times New Roman"/>
+        </w:rPr>
+        <w:t xml:space="preserve">We </w:t>
+      </w:r>
+      <w:r>
+        <w:rPr>
+          <w:rFonts w:ascii="Times New Roman" w:hAnsi="Times New Roman" w:cs="Times New Roman"/>
+        </w:rPr>
+        <w:t>determined that</w:t>
+      </w:r>
+      <w:r>
+        <w:rPr>
+          <w:rFonts w:ascii="Times New Roman" w:hAnsi="Times New Roman" w:cs="Times New Roman"/>
+        </w:rPr>
+        <w:t xml:space="preserve"> absolute latitude, temperature, and background nutrients are correlated</w:t>
+      </w:r>
+      <w:r>
+        <w:rPr>
+          <w:rFonts w:ascii="Times New Roman" w:hAnsi="Times New Roman" w:cs="Times New Roman"/>
+        </w:rPr>
+        <w:t xml:space="preserve"> using a correlation matrix</w:t>
+      </w:r>
+      <w:r>
+        <w:rPr>
+          <w:rFonts w:ascii="Times New Roman" w:hAnsi="Times New Roman" w:cs="Times New Roman"/>
+        </w:rPr>
+        <w:t xml:space="preserve"> (</w:t>
+      </w:r>
+      <w:proofErr w:type="gramStart"/>
+      <w:r>
+        <w:rPr>
+          <w:rFonts w:ascii="Times New Roman" w:hAnsi="Times New Roman" w:cs="Times New Roman"/>
+        </w:rPr>
+        <w:t>metaphor::</w:t>
+      </w:r>
+      <w:proofErr w:type="spellStart"/>
+      <w:proofErr w:type="gramEnd"/>
+      <w:r>
+        <w:rPr>
+          <w:rFonts w:ascii="Times New Roman" w:hAnsi="Times New Roman" w:cs="Times New Roman"/>
+        </w:rPr>
+        <w:t>vif</w:t>
+      </w:r>
+      <w:proofErr w:type="spellEnd"/>
+      <w:r>
+        <w:rPr>
+          <w:rFonts w:ascii="Times New Roman" w:hAnsi="Times New Roman" w:cs="Times New Roman"/>
+        </w:rPr>
+        <w:t>)</w:t>
+      </w:r>
+      <w:r>
+        <w:rPr>
+          <w:rFonts w:ascii="Times New Roman" w:hAnsi="Times New Roman" w:cs="Times New Roman"/>
+        </w:rPr>
+        <w:t xml:space="preserve">, </w:t>
+      </w:r>
+      <w:r>
+        <w:rPr>
+          <w:rFonts w:ascii="Times New Roman" w:hAnsi="Times New Roman" w:cs="Times New Roman"/>
+        </w:rPr>
+        <w:t>so we</w:t>
+      </w:r>
+      <w:r>
+        <w:rPr>
+          <w:rFonts w:ascii="Times New Roman" w:hAnsi="Times New Roman" w:cs="Times New Roman"/>
+        </w:rPr>
+        <w:t xml:space="preserve"> then constructed three reduced models that each contained only one of the correlated moderators</w:t>
+      </w:r>
+      <w:r>
+        <w:rPr>
+          <w:rFonts w:ascii="Times New Roman" w:hAnsi="Times New Roman" w:cs="Times New Roman"/>
+        </w:rPr>
+        <w:t xml:space="preserve"> and competed them against a null model using AIC</w:t>
+      </w:r>
+      <w:r>
+        <w:rPr>
+          <w:rFonts w:ascii="Times New Roman" w:hAnsi="Times New Roman" w:cs="Times New Roman"/>
+        </w:rPr>
+        <w:t xml:space="preserve">. </w:t>
+      </w:r>
+    </w:p>
+    <w:p>
+      <w:pPr>
+        <w:spacing w:line="360" w:lineRule="auto"/>
+        <w:rPr>
+          <w:rFonts w:ascii="Times New Roman" w:hAnsi="Times New Roman" w:cs="Times New Roman"/>
+        </w:rPr>
+      </w:pPr>
+    </w:p>
+    <w:p>
+      <w:pPr>
+        <w:spacing w:line="360" w:lineRule="auto"/>
+        <w:rPr>
+          <w:rFonts w:ascii="Times New Roman" w:hAnsi="Times New Roman" w:cs="Times New Roman"/>
+          <w:i/>
+        </w:rPr>
+      </w:pPr>
+      <w:r>
+        <w:rPr>
+          <w:rFonts w:ascii="Times New Roman" w:hAnsi="Times New Roman" w:cs="Times New Roman"/>
+          <w:i/>
+        </w:rPr>
+        <w:t>Assumption testing</w:t>
+      </w:r>
+    </w:p>
+    <w:p>
+      <w:pPr>
+        <w:spacing w:line="360" w:lineRule="auto"/>
+        <w:rPr>
+          <w:rFonts w:ascii="Times New Roman" w:hAnsi="Times New Roman" w:cs="Times New Roman"/>
+        </w:rPr>
+      </w:pPr>
+      <w:r>
+        <w:rPr>
+          <w:rFonts w:ascii="Times New Roman" w:hAnsi="Times New Roman" w:cs="Times New Roman"/>
+        </w:rPr>
+        <w:tab/>
+      </w:r>
+      <w:r>
+        <w:rPr>
+          <w:rFonts w:ascii="Times New Roman" w:hAnsi="Times New Roman" w:cs="Times New Roman"/>
+        </w:rPr>
+        <w:t>Meta-analyses can be vulnerable to p-value biases, so we</w:t>
+      </w:r>
+      <w:r>
+        <w:rPr>
+          <w:rFonts w:ascii="Times New Roman" w:hAnsi="Times New Roman" w:cs="Times New Roman"/>
+        </w:rPr>
+        <w:t xml:space="preserve"> calculated </w:t>
+      </w:r>
+      <w:r>
+        <w:rPr>
+          <w:rFonts w:ascii="Times New Roman" w:hAnsi="Times New Roman" w:cs="Times New Roman"/>
+        </w:rPr>
+        <w:t>Rosenthal</w:t>
+      </w:r>
+      <w:r>
+        <w:rPr>
+          <w:rFonts w:ascii="Times New Roman" w:hAnsi="Times New Roman" w:cs="Times New Roman"/>
+        </w:rPr>
+        <w:t>’s failsafe</w:t>
+      </w:r>
+      <w:r>
+        <w:rPr>
+          <w:rFonts w:ascii="Times New Roman" w:hAnsi="Times New Roman" w:cs="Times New Roman"/>
+        </w:rPr>
+        <w:t xml:space="preserve"> number </w:t>
+      </w:r>
+      <w:r>
+        <w:rPr>
+          <w:rFonts w:ascii="Times New Roman" w:hAnsi="Times New Roman" w:cs="Times New Roman"/>
+        </w:rPr>
+        <w:t xml:space="preserve">(the number of non-significant studies we would have to include to overturn our results) </w:t>
+      </w:r>
+      <w:r>
+        <w:rPr>
+          <w:rFonts w:ascii="Times New Roman" w:hAnsi="Times New Roman" w:cs="Times New Roman"/>
+        </w:rPr>
+        <w:t xml:space="preserve">as </w:t>
+      </w:r>
+      <w:r>
+        <w:rPr>
+          <w:rFonts w:ascii="Times New Roman" w:hAnsi="Times New Roman" w:cs="Times New Roman"/>
+        </w:rPr>
+        <w:t>13962</w:t>
+      </w:r>
+      <w:r>
+        <w:rPr>
+          <w:rFonts w:ascii="Times New Roman" w:hAnsi="Times New Roman" w:cs="Times New Roman"/>
+        </w:rPr>
+        <w:t xml:space="preserve">. As some reports contributed multiple observations, we looked for a substantial effect of papers that contributed 10% or greater than the total number of observations (n = 3). We reran each model without each of these potentially influential studies and found no major differences in effect sizes or p-values when each of these studies were excluded. </w:t>
+      </w:r>
+      <w:commentRangeStart w:id="11"/>
+      <w:r>
+        <w:rPr>
+          <w:rFonts w:ascii="Times New Roman" w:hAnsi="Times New Roman" w:cs="Times New Roman"/>
+        </w:rPr>
+        <w:t xml:space="preserve">***Funnel </w:t>
+      </w:r>
+      <w:proofErr w:type="gramStart"/>
+      <w:r>
+        <w:rPr>
+          <w:rFonts w:ascii="Times New Roman" w:hAnsi="Times New Roman" w:cs="Times New Roman"/>
+        </w:rPr>
+        <w:t>plots!*</w:t>
+      </w:r>
+      <w:proofErr w:type="gramEnd"/>
+      <w:r>
+        <w:rPr>
+          <w:rFonts w:ascii="Times New Roman" w:hAnsi="Times New Roman" w:cs="Times New Roman"/>
+        </w:rPr>
+        <w:t>**</w:t>
+      </w:r>
+      <w:commentRangeEnd w:id="11"/>
+      <w:r>
+        <w:rPr>
+          <w:rStyle w:val="CommentReference"/>
+        </w:rPr>
+        <w:commentReference w:id="11"/>
+      </w:r>
+    </w:p>
+    <w:p>
+      <w:pPr>
+        <w:spacing w:line="360" w:lineRule="auto"/>
+        <w:rPr>
+          <w:rFonts w:ascii="Times New Roman" w:hAnsi="Times New Roman" w:cs="Times New Roman"/>
+        </w:rPr>
+      </w:pPr>
+    </w:p>
+    <w:p>
+      <w:pPr>
+        <w:spacing w:line="360" w:lineRule="auto"/>
+        <w:rPr>
+          <w:rFonts w:ascii="Times New Roman" w:hAnsi="Times New Roman" w:cs="Times New Roman"/>
+        </w:rPr>
+      </w:pPr>
+    </w:p>
+    <w:p>
+      <w:pPr>
+        <w:spacing w:line="360" w:lineRule="auto"/>
+        <w:rPr>
+          <w:rFonts w:ascii="Times New Roman" w:hAnsi="Times New Roman" w:cs="Times New Roman"/>
+        </w:rPr>
+      </w:pPr>
+    </w:p>
+    <w:p>
+      <w:pPr>
+        <w:spacing w:line="360" w:lineRule="auto"/>
+        <w:rPr>
+          <w:rFonts w:ascii="Times New Roman" w:hAnsi="Times New Roman" w:cs="Times New Roman"/>
+          <w:u w:val="single"/>
+        </w:rPr>
+      </w:pPr>
+      <w:r>
+        <w:rPr>
+          <w:rFonts w:ascii="Times New Roman" w:hAnsi="Times New Roman" w:cs="Times New Roman"/>
+          <w:u w:val="single"/>
+        </w:rPr>
+        <w:t>Results</w:t>
+      </w:r>
+    </w:p>
+    <w:p>
+      <w:pPr>
+        <w:spacing w:line="360" w:lineRule="auto"/>
+        <w:rPr>
+          <w:rFonts w:ascii="Times New Roman" w:hAnsi="Times New Roman" w:cs="Times New Roman"/>
+        </w:rPr>
+      </w:pPr>
+      <w:r>
+        <w:rPr>
+          <w:rFonts w:ascii="Times New Roman" w:hAnsi="Times New Roman" w:cs="Times New Roman"/>
+        </w:rPr>
+        <w:t>Overall the effect of animal-provisioned nutrients on primary productivity was positive. 37 studies contributed 172 effect sizes. Sample sizes were well distributed across all four categories of primary producer (15-30%)</w:t>
+      </w:r>
+      <w:r>
+        <w:rPr>
+          <w:rFonts w:ascii="Times New Roman" w:hAnsi="Times New Roman" w:cs="Times New Roman"/>
+        </w:rPr>
+        <w:t xml:space="preserve">. </w:t>
+      </w:r>
+      <w:proofErr w:type="spellStart"/>
+      <w:r>
+        <w:rPr>
+          <w:rFonts w:ascii="Times New Roman" w:hAnsi="Times New Roman" w:cs="Times New Roman"/>
+        </w:rPr>
+        <w:t>Unstocked</w:t>
+      </w:r>
+      <w:proofErr w:type="spellEnd"/>
+      <w:r>
+        <w:rPr>
+          <w:rFonts w:ascii="Times New Roman" w:hAnsi="Times New Roman" w:cs="Times New Roman"/>
+        </w:rPr>
+        <w:t xml:space="preserve"> field experiments constituted the majority of experimental designs</w:t>
+      </w:r>
+      <w:r>
+        <w:rPr>
+          <w:rFonts w:ascii="Times New Roman" w:hAnsi="Times New Roman" w:cs="Times New Roman"/>
+        </w:rPr>
+        <w:t xml:space="preserve"> (43%)</w:t>
+      </w:r>
+      <w:r>
+        <w:rPr>
+          <w:rFonts w:ascii="Times New Roman" w:hAnsi="Times New Roman" w:cs="Times New Roman"/>
+        </w:rPr>
+        <w:t>, but all categories were well represented in the sample size</w:t>
+      </w:r>
+      <w:r>
+        <w:rPr>
+          <w:rFonts w:ascii="Times New Roman" w:hAnsi="Times New Roman" w:cs="Times New Roman"/>
+        </w:rPr>
+        <w:t xml:space="preserve"> (8-43%)</w:t>
+      </w:r>
+      <w:r>
+        <w:rPr>
+          <w:rFonts w:ascii="Times New Roman" w:hAnsi="Times New Roman" w:cs="Times New Roman"/>
+        </w:rPr>
+        <w:t>, with the exception of field experiments</w:t>
+      </w:r>
+      <w:r>
+        <w:rPr>
+          <w:rFonts w:ascii="Times New Roman" w:hAnsi="Times New Roman" w:cs="Times New Roman"/>
+        </w:rPr>
+        <w:t xml:space="preserve"> where both the consumer and producer were stocked (5%)</w:t>
+      </w:r>
+      <w:r>
+        <w:rPr>
+          <w:rFonts w:ascii="Times New Roman" w:hAnsi="Times New Roman" w:cs="Times New Roman"/>
+        </w:rPr>
+        <w:t xml:space="preserve">. </w:t>
+      </w:r>
+    </w:p>
+    <w:p>
+      <w:pPr>
+        <w:spacing w:line="360" w:lineRule="auto"/>
+        <w:rPr>
+          <w:rFonts w:ascii="Times New Roman" w:hAnsi="Times New Roman" w:cs="Times New Roman"/>
+        </w:rPr>
+      </w:pPr>
+    </w:p>
+    <w:p>
+      <w:pPr>
+        <w:spacing w:line="360" w:lineRule="auto"/>
+        <w:rPr>
+          <w:rFonts w:ascii="Times New Roman" w:hAnsi="Times New Roman" w:cs="Times New Roman"/>
+        </w:rPr>
+      </w:pPr>
+      <w:r>
+        <w:rPr>
+          <w:rFonts w:ascii="Times New Roman" w:hAnsi="Times New Roman" w:cs="Times New Roman"/>
+        </w:rPr>
+        <w:t>When we compared each of the models containing absolute latitude, temperature, and background nutrients against a null model, the model containing background nutrients has the lowest AIC value, but there is strong support for all three models containing moderators (</w:t>
+      </w:r>
+      <w:r>
+        <w:rPr>
+          <w:rFonts w:ascii="Times New Roman" w:hAnsi="Times New Roman" w:cs="Times New Roman"/>
+        </w:rPr>
+        <w:t>2</w:t>
+      </w:r>
+      <w:r>
+        <w:rPr>
+          <w:rFonts w:ascii="Times New Roman" w:hAnsi="Times New Roman" w:cs="Times New Roman"/>
+        </w:rPr>
+        <w:t xml:space="preserve"> </w:t>
+      </w:r>
+      <w:r>
+        <w:rPr>
+          <w:rFonts w:ascii="Times New Roman" w:hAnsi="Times New Roman" w:cs="Times New Roman"/>
+        </w:rPr>
+        <w:t>&lt;</w:t>
+      </w:r>
+      <w:r>
+        <w:rPr>
+          <w:rFonts w:ascii="Times New Roman" w:hAnsi="Times New Roman" w:cs="Times New Roman"/>
+        </w:rPr>
+        <w:t xml:space="preserve"> </w:t>
+      </w:r>
+      <w:r>
+        <w:rPr>
+          <w:rFonts w:ascii="Times New Roman" w:hAnsi="Times New Roman" w:cs="Times New Roman"/>
+        </w:rPr>
+        <w:t>Δ</w:t>
+      </w:r>
+      <w:r>
+        <w:rPr>
+          <w:rFonts w:ascii="Cambria Math" w:hAnsi="Cambria Math" w:cs="Cambria Math"/>
+        </w:rPr>
+        <w:t>𝑖</w:t>
+      </w:r>
+      <w:r>
+        <w:rPr>
+          <w:rFonts w:ascii="Cambria Math" w:hAnsi="Cambria Math" w:cs="Cambria Math"/>
+        </w:rPr>
+        <w:t xml:space="preserve"> </w:t>
+      </w:r>
+      <w:r>
+        <w:rPr>
+          <w:rFonts w:ascii="Times New Roman" w:hAnsi="Times New Roman" w:cs="Times New Roman"/>
+        </w:rPr>
+        <w:t>&lt;</w:t>
+      </w:r>
+      <w:r>
+        <w:rPr>
+          <w:rFonts w:ascii="Times New Roman" w:hAnsi="Times New Roman" w:cs="Times New Roman"/>
+        </w:rPr>
+        <w:t xml:space="preserve"> </w:t>
+      </w:r>
+      <w:r>
+        <w:rPr>
+          <w:rFonts w:ascii="Times New Roman" w:hAnsi="Times New Roman" w:cs="Times New Roman"/>
+        </w:rPr>
+        <w:t>4</w:t>
+      </w:r>
+      <w:r>
+        <w:rPr>
+          <w:rFonts w:ascii="Times New Roman" w:hAnsi="Times New Roman" w:cs="Times New Roman"/>
+        </w:rPr>
+        <w:t>), which were preferred over the null model (</w:t>
+      </w:r>
+      <w:r>
+        <w:rPr>
+          <w:rFonts w:ascii="Times New Roman" w:hAnsi="Times New Roman" w:cs="Times New Roman"/>
+        </w:rPr>
+        <w:t>Δ</w:t>
+      </w:r>
+      <w:r>
+        <w:rPr>
+          <w:rFonts w:ascii="Cambria Math" w:hAnsi="Cambria Math" w:cs="Cambria Math"/>
+        </w:rPr>
+        <w:t>𝑖</w:t>
+      </w:r>
+      <w:r>
+        <w:rPr>
+          <w:rFonts w:ascii="Cambria Math" w:hAnsi="Cambria Math" w:cs="Cambria Math"/>
+        </w:rPr>
+        <w:t xml:space="preserve"> </w:t>
+      </w:r>
+      <w:r>
+        <w:rPr>
+          <w:rFonts w:ascii="Times New Roman" w:hAnsi="Times New Roman" w:cs="Times New Roman"/>
+        </w:rPr>
+        <w:t>&gt;</w:t>
+      </w:r>
+      <w:r>
+        <w:rPr>
+          <w:rFonts w:ascii="Times New Roman" w:hAnsi="Times New Roman" w:cs="Times New Roman"/>
+        </w:rPr>
+        <w:t xml:space="preserve"> </w:t>
+      </w:r>
+      <w:r>
+        <w:rPr>
+          <w:rFonts w:ascii="Times New Roman" w:hAnsi="Times New Roman" w:cs="Times New Roman"/>
+        </w:rPr>
+        <w:t>10</w:t>
+      </w:r>
+      <w:r>
+        <w:rPr>
+          <w:rFonts w:ascii="Times New Roman" w:hAnsi="Times New Roman" w:cs="Times New Roman"/>
+        </w:rPr>
+        <w:t xml:space="preserve">, </w:t>
+      </w:r>
+      <w:r>
+        <w:rPr>
+          <w:rFonts w:ascii="Times New Roman" w:hAnsi="Times New Roman" w:cs="Times New Roman"/>
+          <w:highlight w:val="green"/>
+        </w:rPr>
+        <w:t>Table 1</w:t>
+      </w:r>
+      <w:r>
+        <w:rPr>
+          <w:rFonts w:ascii="Times New Roman" w:hAnsi="Times New Roman" w:cs="Times New Roman"/>
+        </w:rPr>
+        <w:t xml:space="preserve">). </w:t>
+      </w:r>
+      <w:proofErr w:type="gramStart"/>
+      <w:r>
+        <w:rPr>
+          <w:rFonts w:ascii="Times New Roman" w:hAnsi="Times New Roman" w:cs="Times New Roman"/>
+        </w:rPr>
+        <w:t>Therefore</w:t>
+      </w:r>
+      <w:proofErr w:type="gramEnd"/>
+      <w:r>
+        <w:rPr>
+          <w:rFonts w:ascii="Times New Roman" w:hAnsi="Times New Roman" w:cs="Times New Roman"/>
+        </w:rPr>
+        <w:t xml:space="preserve"> we report results from all three models.</w:t>
+      </w:r>
+    </w:p>
+    <w:p>
+      <w:pPr>
+        <w:spacing w:line="360" w:lineRule="auto"/>
+        <w:rPr>
+          <w:rFonts w:ascii="Times New Roman" w:hAnsi="Times New Roman" w:cs="Times New Roman"/>
+        </w:rPr>
+      </w:pPr>
+    </w:p>
+    <w:p>
+      <w:pPr>
+        <w:spacing w:line="360" w:lineRule="auto"/>
+        <w:rPr>
+          <w:rFonts w:ascii="Times New Roman" w:hAnsi="Times New Roman" w:cs="Times New Roman"/>
+        </w:rPr>
+      </w:pPr>
+      <w:r>
+        <w:rPr>
+          <w:rFonts w:ascii="Times New Roman" w:hAnsi="Times New Roman" w:cs="Times New Roman"/>
+        </w:rPr>
+        <w:lastRenderedPageBreak/>
+        <w:t>Background nutrients model:</w:t>
+      </w:r>
+    </w:p>
+    <w:p>
+      <w:pPr>
+        <w:spacing w:line="360" w:lineRule="auto"/>
+        <w:rPr>
+          <w:rFonts w:ascii="Times New Roman" w:hAnsi="Times New Roman" w:cs="Times New Roman"/>
+        </w:rPr>
+      </w:pPr>
+      <w:r>
+        <w:rPr>
+          <w:rFonts w:ascii="Times New Roman" w:hAnsi="Times New Roman" w:cs="Times New Roman"/>
+        </w:rPr>
+        <w:t>Overall, there was a positive effect of animal-provisioned nutrients on primary productivity (</w:t>
+      </w:r>
+      <w:r>
+        <w:rPr>
+          <w:rFonts w:ascii="Times New Roman" w:hAnsi="Times New Roman" w:cs="Times New Roman"/>
+          <w:lang w:val="en-CA"/>
+        </w:rPr>
+        <w:t>log transformed ratio of means</w:t>
+      </w:r>
+      <w:r>
+        <w:rPr>
+          <w:rFonts w:ascii="Times New Roman" w:hAnsi="Times New Roman" w:cs="Times New Roman"/>
+          <w:lang w:val="en-CA"/>
+        </w:rPr>
+        <w:t xml:space="preserve"> </w:t>
+      </w:r>
+      <w:r>
+        <w:rPr>
+          <w:rFonts w:ascii="Times New Roman" w:hAnsi="Times New Roman" w:cs="Times New Roman"/>
+          <w:lang w:val="en-CA"/>
+        </w:rPr>
+        <w:t xml:space="preserve">± </w:t>
+      </w:r>
+      <w:r>
+        <w:rPr>
+          <w:rFonts w:ascii="Times New Roman" w:hAnsi="Times New Roman" w:cs="Times New Roman"/>
+          <w:lang w:val="en-CA"/>
+        </w:rPr>
+        <w:t>SE;</w:t>
+      </w:r>
+      <w:r>
+        <w:rPr>
+          <w:rFonts w:ascii="Times New Roman" w:hAnsi="Times New Roman" w:cs="Times New Roman"/>
+        </w:rPr>
+        <w:t xml:space="preserve"> 0.5892 </w:t>
+      </w:r>
+      <w:r>
+        <w:rPr>
+          <w:rFonts w:ascii="Times New Roman" w:hAnsi="Times New Roman" w:cs="Times New Roman"/>
+          <w:lang w:val="en-CA"/>
+        </w:rPr>
+        <w:t>±</w:t>
+      </w:r>
+      <w:r>
+        <w:rPr>
+          <w:rFonts w:ascii="Times New Roman" w:hAnsi="Times New Roman" w:cs="Times New Roman"/>
+          <w:lang w:val="en-CA"/>
+        </w:rPr>
+        <w:t xml:space="preserve"> </w:t>
+      </w:r>
+      <w:r>
+        <w:rPr>
+          <w:rFonts w:ascii="Times New Roman" w:hAnsi="Times New Roman" w:cs="Times New Roman"/>
+        </w:rPr>
+        <w:t>0.1580</w:t>
+      </w:r>
+      <w:r>
+        <w:rPr>
+          <w:rFonts w:ascii="Times New Roman" w:hAnsi="Times New Roman" w:cs="Times New Roman"/>
+        </w:rPr>
+        <w:t xml:space="preserve">, p = </w:t>
+      </w:r>
+      <w:r>
+        <w:rPr>
+          <w:rFonts w:ascii="Times New Roman" w:hAnsi="Times New Roman" w:cs="Times New Roman"/>
+        </w:rPr>
+        <w:t>0.0003</w:t>
+      </w:r>
+      <w:r>
+        <w:rPr>
+          <w:rFonts w:ascii="Times New Roman" w:hAnsi="Times New Roman" w:cs="Times New Roman"/>
+        </w:rPr>
+        <w:t xml:space="preserve">). </w:t>
+      </w:r>
+      <w:r>
+        <w:rPr>
+          <w:rFonts w:ascii="Times New Roman" w:hAnsi="Times New Roman" w:cs="Times New Roman"/>
+        </w:rPr>
+        <w:t>There was only weak evidence for a</w:t>
+      </w:r>
+      <w:r>
+        <w:rPr>
+          <w:rFonts w:ascii="Times New Roman" w:hAnsi="Times New Roman" w:cs="Times New Roman"/>
+        </w:rPr>
+        <w:t xml:space="preserve"> slightly positive</w:t>
+      </w:r>
+      <w:r>
+        <w:rPr>
+          <w:rFonts w:ascii="Times New Roman" w:hAnsi="Times New Roman" w:cs="Times New Roman"/>
+        </w:rPr>
+        <w:t xml:space="preserve"> effect of background nutrients on the effect of </w:t>
+      </w:r>
+      <w:r>
+        <w:rPr>
+          <w:rFonts w:ascii="Times New Roman" w:hAnsi="Times New Roman" w:cs="Times New Roman"/>
+          <w:lang w:val="en-CA"/>
+        </w:rPr>
+        <w:t>animal</w:t>
+      </w:r>
+      <w:r>
+        <w:rPr>
+          <w:rFonts w:ascii="Times New Roman" w:hAnsi="Times New Roman" w:cs="Times New Roman"/>
+          <w:lang w:val="en-CA"/>
+        </w:rPr>
+        <w:t>-</w:t>
+      </w:r>
+      <w:r>
+        <w:rPr>
+          <w:rFonts w:ascii="Times New Roman" w:hAnsi="Times New Roman" w:cs="Times New Roman"/>
+          <w:lang w:val="en-CA"/>
+        </w:rPr>
+        <w:t>provisioned nutrients</w:t>
+      </w:r>
+      <w:r>
+        <w:rPr>
+          <w:rFonts w:ascii="Times New Roman" w:hAnsi="Times New Roman" w:cs="Times New Roman"/>
+          <w:lang w:val="en-CA"/>
+        </w:rPr>
+        <w:t xml:space="preserve"> on primary productivity (</w:t>
+      </w:r>
+      <w:r>
+        <w:rPr>
+          <w:rFonts w:ascii="Times New Roman" w:hAnsi="Times New Roman" w:cs="Times New Roman"/>
+          <w:lang w:val="en-CA"/>
+        </w:rPr>
+        <w:t>0.1275</w:t>
+      </w:r>
+      <w:r>
+        <w:rPr>
+          <w:rFonts w:ascii="Times New Roman" w:hAnsi="Times New Roman" w:cs="Times New Roman"/>
+          <w:lang w:val="en-CA"/>
+        </w:rPr>
+        <w:t xml:space="preserve"> </w:t>
+      </w:r>
+      <w:r>
+        <w:rPr>
+          <w:rFonts w:ascii="Times New Roman" w:hAnsi="Times New Roman" w:cs="Times New Roman"/>
+          <w:lang w:val="en-CA"/>
+        </w:rPr>
+        <w:t>±</w:t>
+      </w:r>
+      <w:r>
+        <w:t xml:space="preserve"> </w:t>
+      </w:r>
+      <w:r>
+        <w:rPr>
+          <w:rFonts w:ascii="Times New Roman" w:hAnsi="Times New Roman" w:cs="Times New Roman"/>
+          <w:lang w:val="en-CA"/>
+        </w:rPr>
+        <w:t>0.0748</w:t>
+      </w:r>
+      <w:r>
+        <w:rPr>
+          <w:rFonts w:ascii="Times New Roman" w:hAnsi="Times New Roman" w:cs="Times New Roman"/>
+          <w:lang w:val="en-CA"/>
+        </w:rPr>
+        <w:t xml:space="preserve">, p = </w:t>
+      </w:r>
+      <w:r>
+        <w:rPr>
+          <w:rFonts w:ascii="Times New Roman" w:hAnsi="Times New Roman" w:cs="Times New Roman"/>
+          <w:lang w:val="en-CA"/>
+        </w:rPr>
+        <w:t>0.0903</w:t>
+      </w:r>
+      <w:r>
+        <w:rPr>
+          <w:rFonts w:ascii="Times New Roman" w:hAnsi="Times New Roman" w:cs="Times New Roman"/>
+          <w:lang w:val="en-CA"/>
+        </w:rPr>
+        <w:t xml:space="preserve">). </w:t>
+      </w:r>
+      <w:r>
+        <w:rPr>
+          <w:rFonts w:ascii="Times New Roman" w:hAnsi="Times New Roman" w:cs="Times New Roman"/>
+        </w:rPr>
+        <w:t>Including moderators was significantly better than a null model (</w:t>
+      </w:r>
+      <w:proofErr w:type="gramStart"/>
+      <w:r>
+        <w:rPr>
+          <w:rFonts w:ascii="Times New Roman" w:hAnsi="Times New Roman" w:cs="Times New Roman"/>
+        </w:rPr>
+        <w:t>F</w:t>
+      </w:r>
+      <w:r>
+        <w:rPr>
+          <w:rFonts w:ascii="Times New Roman" w:hAnsi="Times New Roman" w:cs="Times New Roman"/>
+          <w:vertAlign w:val="subscript"/>
+        </w:rPr>
+        <w:t>(</w:t>
+      </w:r>
+      <w:proofErr w:type="gramEnd"/>
+      <w:r>
+        <w:rPr>
+          <w:rFonts w:ascii="Times New Roman" w:hAnsi="Times New Roman" w:cs="Times New Roman"/>
+          <w:vertAlign w:val="subscript"/>
+        </w:rPr>
+        <w:t>8,163</w:t>
+      </w:r>
+      <w:r>
+        <w:rPr>
+          <w:rFonts w:ascii="Times New Roman" w:hAnsi="Times New Roman" w:cs="Times New Roman"/>
+          <w:vertAlign w:val="subscript"/>
+        </w:rPr>
+        <w:t xml:space="preserve">) </w:t>
+      </w:r>
+      <w:r>
+        <w:rPr>
+          <w:rFonts w:ascii="Times New Roman" w:hAnsi="Times New Roman" w:cs="Times New Roman"/>
+        </w:rPr>
+        <w:t>= 2.1056, p = 0.0380</w:t>
+      </w:r>
+      <w:r>
+        <w:rPr>
+          <w:rFonts w:ascii="Times New Roman" w:hAnsi="Times New Roman" w:cs="Times New Roman"/>
+        </w:rPr>
+        <w:t xml:space="preserve">), although there was still a </w:t>
+      </w:r>
+      <w:r>
+        <w:rPr>
+          <w:rFonts w:ascii="Times New Roman" w:hAnsi="Times New Roman" w:cs="Times New Roman"/>
+        </w:rPr>
+        <w:t>significant</w:t>
+      </w:r>
+      <w:r>
+        <w:rPr>
+          <w:rFonts w:ascii="Times New Roman" w:hAnsi="Times New Roman" w:cs="Times New Roman"/>
+        </w:rPr>
+        <w:t xml:space="preserve"> amount of residual h</w:t>
+      </w:r>
+      <w:r>
+        <w:rPr>
+          <w:rFonts w:ascii="Times New Roman" w:hAnsi="Times New Roman" w:cs="Times New Roman"/>
+        </w:rPr>
+        <w:t>eterogeneity</w:t>
+      </w:r>
+      <w:r>
+        <w:rPr>
+          <w:rFonts w:ascii="Times New Roman" w:hAnsi="Times New Roman" w:cs="Times New Roman"/>
+        </w:rPr>
+        <w:t xml:space="preserve"> unexplained by the model (</w:t>
+      </w:r>
+      <w:r>
+        <w:rPr>
+          <w:rFonts w:ascii="Times New Roman" w:hAnsi="Times New Roman" w:cs="Times New Roman"/>
+        </w:rPr>
+        <w:t>QE</w:t>
+      </w:r>
+      <w:r>
+        <w:rPr>
+          <w:rFonts w:ascii="Times New Roman" w:hAnsi="Times New Roman" w:cs="Times New Roman"/>
+          <w:vertAlign w:val="subscript"/>
+        </w:rPr>
+        <w:t>163</w:t>
+      </w:r>
+      <w:r>
+        <w:rPr>
+          <w:rFonts w:ascii="Times New Roman" w:hAnsi="Times New Roman" w:cs="Times New Roman"/>
+        </w:rPr>
+        <w:t xml:space="preserve"> </w:t>
+      </w:r>
+      <w:r>
+        <w:rPr>
+          <w:rFonts w:ascii="Times New Roman" w:hAnsi="Times New Roman" w:cs="Times New Roman"/>
+        </w:rPr>
+        <w:t xml:space="preserve">= 3083.7320, p &lt; </w:t>
+      </w:r>
+      <w:r>
+        <w:rPr>
+          <w:rFonts w:ascii="Times New Roman" w:hAnsi="Times New Roman" w:cs="Times New Roman"/>
+        </w:rPr>
+        <w:t>0.</w:t>
+      </w:r>
+      <w:r>
+        <w:rPr>
+          <w:rFonts w:ascii="Times New Roman" w:hAnsi="Times New Roman" w:cs="Times New Roman"/>
+        </w:rPr>
+        <w:t>0001</w:t>
+      </w:r>
+      <w:r>
+        <w:rPr>
+          <w:rFonts w:ascii="Times New Roman" w:hAnsi="Times New Roman" w:cs="Times New Roman"/>
+        </w:rPr>
+        <w:t xml:space="preserve">). </w:t>
+      </w:r>
+      <w:r>
+        <w:rPr>
+          <w:rFonts w:ascii="Times New Roman" w:hAnsi="Times New Roman" w:cs="Times New Roman"/>
+          <w:lang w:val="en-CA"/>
+        </w:rPr>
+        <w:t>Algae (</w:t>
+      </w:r>
+      <w:r>
+        <w:rPr>
+          <w:rFonts w:ascii="Times New Roman" w:hAnsi="Times New Roman" w:cs="Times New Roman"/>
+        </w:rPr>
+        <w:t xml:space="preserve">0.5892 </w:t>
+      </w:r>
+      <w:r>
+        <w:rPr>
+          <w:rFonts w:ascii="Times New Roman" w:hAnsi="Times New Roman" w:cs="Times New Roman"/>
+          <w:lang w:val="en-CA"/>
+        </w:rPr>
+        <w:t>±</w:t>
+      </w:r>
+      <w:r>
+        <w:rPr>
+          <w:rFonts w:ascii="Times New Roman" w:hAnsi="Times New Roman" w:cs="Times New Roman"/>
+          <w:lang w:val="en-CA"/>
+        </w:rPr>
+        <w:t xml:space="preserve"> </w:t>
+      </w:r>
+      <w:r>
+        <w:rPr>
+          <w:rFonts w:ascii="Times New Roman" w:hAnsi="Times New Roman" w:cs="Times New Roman"/>
+        </w:rPr>
+        <w:t>0.1580</w:t>
+      </w:r>
+      <w:r>
+        <w:rPr>
+          <w:rFonts w:ascii="Times New Roman" w:hAnsi="Times New Roman" w:cs="Times New Roman"/>
+        </w:rPr>
+        <w:t xml:space="preserve">) </w:t>
+      </w:r>
+      <w:r>
+        <w:rPr>
+          <w:rFonts w:ascii="Times New Roman" w:hAnsi="Times New Roman" w:cs="Times New Roman"/>
+          <w:lang w:val="en-CA"/>
+        </w:rPr>
+        <w:t>showed the largest response to animal-provisioned nutrients, however the effect on corals (</w:t>
+      </w:r>
+      <w:r>
+        <w:rPr>
+          <w:rFonts w:ascii="Times New Roman" w:hAnsi="Times New Roman" w:cs="Times New Roman"/>
+          <w:lang w:val="en-CA"/>
+        </w:rPr>
+        <w:t xml:space="preserve">0.4413 </w:t>
+      </w:r>
+      <w:r>
+        <w:rPr>
+          <w:rFonts w:ascii="Times New Roman" w:hAnsi="Times New Roman" w:cs="Times New Roman"/>
+          <w:lang w:val="en-CA"/>
+        </w:rPr>
+        <w:t>±</w:t>
+      </w:r>
+      <w:r>
+        <w:rPr>
+          <w:rFonts w:ascii="Times New Roman" w:hAnsi="Times New Roman" w:cs="Times New Roman"/>
+          <w:lang w:val="en-CA"/>
+        </w:rPr>
+        <w:t xml:space="preserve"> </w:t>
+      </w:r>
+      <w:r>
+        <w:rPr>
+          <w:rFonts w:ascii="Times New Roman" w:hAnsi="Times New Roman" w:cs="Times New Roman"/>
+          <w:lang w:val="en-CA"/>
+        </w:rPr>
+        <w:t>0.20</w:t>
+      </w:r>
+      <w:r>
+        <w:rPr>
+          <w:rFonts w:ascii="Times New Roman" w:hAnsi="Times New Roman" w:cs="Times New Roman"/>
+          <w:lang w:val="en-CA"/>
+        </w:rPr>
+        <w:t>30) was not significantly smaller.</w:t>
+      </w:r>
+      <w:r>
+        <w:rPr>
+          <w:rFonts w:ascii="Times New Roman" w:hAnsi="Times New Roman" w:cs="Times New Roman"/>
+          <w:lang w:val="en-CA"/>
+        </w:rPr>
+        <w:t xml:space="preserve"> </w:t>
+      </w:r>
+      <w:r>
+        <w:rPr>
+          <w:rFonts w:ascii="Times New Roman" w:hAnsi="Times New Roman" w:cs="Times New Roman"/>
+          <w:lang w:val="en-CA"/>
+        </w:rPr>
+        <w:t>Phytoplankton (</w:t>
+      </w:r>
+      <w:r>
+        <w:rPr>
+          <w:rFonts w:ascii="Times New Roman" w:hAnsi="Times New Roman" w:cs="Times New Roman"/>
+          <w:lang w:val="en-CA"/>
+        </w:rPr>
+        <w:t>0.0887</w:t>
+      </w:r>
+      <w:r>
+        <w:rPr>
+          <w:rFonts w:ascii="Times New Roman" w:hAnsi="Times New Roman" w:cs="Times New Roman"/>
+          <w:lang w:val="en-CA"/>
+        </w:rPr>
+        <w:t xml:space="preserve"> </w:t>
+      </w:r>
+      <w:r>
+        <w:rPr>
+          <w:rFonts w:ascii="Times New Roman" w:hAnsi="Times New Roman" w:cs="Times New Roman"/>
+          <w:lang w:val="en-CA"/>
+        </w:rPr>
+        <w:t>±</w:t>
+      </w:r>
+      <w:r>
+        <w:rPr>
+          <w:rFonts w:ascii="Times New Roman" w:hAnsi="Times New Roman" w:cs="Times New Roman"/>
+          <w:lang w:val="en-CA"/>
+        </w:rPr>
+        <w:t xml:space="preserve"> </w:t>
+      </w:r>
+      <w:r>
+        <w:rPr>
+          <w:rFonts w:ascii="Times New Roman" w:hAnsi="Times New Roman" w:cs="Times New Roman"/>
+          <w:lang w:val="en-CA"/>
+        </w:rPr>
+        <w:t>0.2382</w:t>
+      </w:r>
+      <w:r>
+        <w:rPr>
+          <w:rFonts w:ascii="Times New Roman" w:hAnsi="Times New Roman" w:cs="Times New Roman"/>
+          <w:lang w:val="en-CA"/>
+        </w:rPr>
+        <w:t>) and vascular plants (</w:t>
+      </w:r>
+      <w:r>
+        <w:rPr>
+          <w:rFonts w:ascii="Times New Roman" w:hAnsi="Times New Roman" w:cs="Times New Roman"/>
+          <w:lang w:val="en-CA"/>
+        </w:rPr>
+        <w:t>0.0416</w:t>
+      </w:r>
+      <w:r>
+        <w:rPr>
+          <w:rFonts w:ascii="Times New Roman" w:hAnsi="Times New Roman" w:cs="Times New Roman"/>
+          <w:lang w:val="en-CA"/>
+        </w:rPr>
+        <w:t xml:space="preserve"> </w:t>
+      </w:r>
+      <w:r>
+        <w:rPr>
+          <w:rFonts w:ascii="Times New Roman" w:hAnsi="Times New Roman" w:cs="Times New Roman"/>
+          <w:lang w:val="en-CA"/>
+        </w:rPr>
+        <w:t>±</w:t>
+      </w:r>
+      <w:r>
+        <w:rPr>
+          <w:rFonts w:ascii="Times New Roman" w:hAnsi="Times New Roman" w:cs="Times New Roman"/>
+          <w:lang w:val="en-CA"/>
+        </w:rPr>
+        <w:t xml:space="preserve"> </w:t>
+      </w:r>
+      <w:r>
+        <w:rPr>
+          <w:rFonts w:ascii="Times New Roman" w:hAnsi="Times New Roman" w:cs="Times New Roman"/>
+          <w:lang w:val="en-CA"/>
+        </w:rPr>
+        <w:t>0.195</w:t>
+      </w:r>
+      <w:r>
+        <w:rPr>
+          <w:rFonts w:ascii="Times New Roman" w:hAnsi="Times New Roman" w:cs="Times New Roman"/>
+          <w:lang w:val="en-CA"/>
+        </w:rPr>
+        <w:t>8) showed significantly smaller effect sizes</w:t>
+      </w:r>
+      <w:r>
+        <w:rPr>
+          <w:rFonts w:ascii="Times New Roman" w:hAnsi="Times New Roman" w:cs="Times New Roman"/>
+          <w:lang w:val="en-CA"/>
+        </w:rPr>
+        <w:t xml:space="preserve"> (</w:t>
+      </w:r>
+      <w:r>
+        <w:rPr>
+          <w:rFonts w:ascii="Times New Roman" w:hAnsi="Times New Roman" w:cs="Times New Roman"/>
+          <w:highlight w:val="yellow"/>
+          <w:lang w:val="en-CA"/>
+        </w:rPr>
+        <w:t>Fig. X</w:t>
+      </w:r>
+      <w:r>
+        <w:rPr>
+          <w:rFonts w:ascii="Times New Roman" w:hAnsi="Times New Roman" w:cs="Times New Roman"/>
+          <w:lang w:val="en-CA"/>
+        </w:rPr>
+        <w:t>)</w:t>
+      </w:r>
+      <w:r>
+        <w:rPr>
+          <w:rFonts w:ascii="Times New Roman" w:hAnsi="Times New Roman" w:cs="Times New Roman"/>
+          <w:lang w:val="en-CA"/>
+        </w:rPr>
+        <w:t xml:space="preserve">. </w:t>
+      </w:r>
+      <w:proofErr w:type="spellStart"/>
+      <w:r>
+        <w:rPr>
+          <w:rFonts w:ascii="Times New Roman" w:hAnsi="Times New Roman" w:cs="Times New Roman"/>
+        </w:rPr>
+        <w:t>U</w:t>
+      </w:r>
+      <w:r>
+        <w:rPr>
+          <w:rFonts w:ascii="Times New Roman" w:hAnsi="Times New Roman" w:cs="Times New Roman"/>
+        </w:rPr>
+        <w:t>nstocked</w:t>
+      </w:r>
+      <w:proofErr w:type="spellEnd"/>
+      <w:r>
+        <w:rPr>
+          <w:rFonts w:ascii="Times New Roman" w:hAnsi="Times New Roman" w:cs="Times New Roman"/>
+        </w:rPr>
+        <w:t xml:space="preserve"> field experiments </w:t>
+      </w:r>
+      <w:r>
+        <w:rPr>
+          <w:rFonts w:ascii="Times New Roman" w:hAnsi="Times New Roman" w:cs="Times New Roman"/>
+          <w:lang w:val="en-CA"/>
+        </w:rPr>
+        <w:t>(</w:t>
+      </w:r>
+      <w:r>
+        <w:rPr>
+          <w:rFonts w:ascii="Times New Roman" w:hAnsi="Times New Roman" w:cs="Times New Roman"/>
+        </w:rPr>
+        <w:t xml:space="preserve">0.5892 </w:t>
+      </w:r>
+      <w:r>
+        <w:rPr>
+          <w:rFonts w:ascii="Times New Roman" w:hAnsi="Times New Roman" w:cs="Times New Roman"/>
+          <w:lang w:val="en-CA"/>
+        </w:rPr>
+        <w:t>±</w:t>
+      </w:r>
+      <w:r>
+        <w:rPr>
+          <w:rFonts w:ascii="Times New Roman" w:hAnsi="Times New Roman" w:cs="Times New Roman"/>
+          <w:lang w:val="en-CA"/>
+        </w:rPr>
+        <w:t xml:space="preserve"> </w:t>
+      </w:r>
+      <w:r>
+        <w:rPr>
+          <w:rFonts w:ascii="Times New Roman" w:hAnsi="Times New Roman" w:cs="Times New Roman"/>
+        </w:rPr>
+        <w:t>0.1580</w:t>
+      </w:r>
+      <w:r>
+        <w:rPr>
+          <w:rFonts w:ascii="Times New Roman" w:hAnsi="Times New Roman" w:cs="Times New Roman"/>
+        </w:rPr>
+        <w:t xml:space="preserve">) </w:t>
+      </w:r>
+      <w:r>
+        <w:rPr>
+          <w:rFonts w:ascii="Times New Roman" w:hAnsi="Times New Roman" w:cs="Times New Roman"/>
+        </w:rPr>
+        <w:t>were not significantly different than field experiments with stocked producers (</w:t>
+      </w:r>
+      <w:r>
+        <w:rPr>
+          <w:rFonts w:ascii="Times New Roman" w:hAnsi="Times New Roman" w:cs="Times New Roman"/>
+        </w:rPr>
+        <w:t>0.364</w:t>
+      </w:r>
+      <w:r>
+        <w:rPr>
+          <w:rFonts w:ascii="Times New Roman" w:hAnsi="Times New Roman" w:cs="Times New Roman"/>
+        </w:rPr>
+        <w:t xml:space="preserve">1 </w:t>
+      </w:r>
+      <w:r>
+        <w:rPr>
+          <w:rFonts w:ascii="Times New Roman" w:hAnsi="Times New Roman" w:cs="Times New Roman"/>
+          <w:lang w:val="en-CA"/>
+        </w:rPr>
+        <w:t>±</w:t>
+      </w:r>
+      <w:r>
+        <w:rPr>
+          <w:rFonts w:ascii="Times New Roman" w:hAnsi="Times New Roman" w:cs="Times New Roman"/>
+          <w:lang w:val="en-CA"/>
+        </w:rPr>
+        <w:t xml:space="preserve"> </w:t>
+      </w:r>
+      <w:r>
+        <w:rPr>
+          <w:rFonts w:ascii="Times New Roman" w:hAnsi="Times New Roman" w:cs="Times New Roman"/>
+          <w:lang w:val="en-CA"/>
+        </w:rPr>
+        <w:t>0.2287</w:t>
+      </w:r>
+      <w:r>
+        <w:rPr>
+          <w:rFonts w:ascii="Times New Roman" w:hAnsi="Times New Roman" w:cs="Times New Roman"/>
+          <w:lang w:val="en-CA"/>
+        </w:rPr>
+        <w:t>)</w:t>
+      </w:r>
+      <w:r>
+        <w:rPr>
+          <w:rFonts w:ascii="Times New Roman" w:hAnsi="Times New Roman" w:cs="Times New Roman"/>
+        </w:rPr>
+        <w:t xml:space="preserve"> or mesocosms (</w:t>
+      </w:r>
+      <w:r>
+        <w:rPr>
+          <w:rFonts w:ascii="Times New Roman" w:hAnsi="Times New Roman" w:cs="Times New Roman"/>
+        </w:rPr>
+        <w:t>0.6800</w:t>
+      </w:r>
+      <w:r>
+        <w:rPr>
+          <w:rFonts w:ascii="Times New Roman" w:hAnsi="Times New Roman" w:cs="Times New Roman"/>
+        </w:rPr>
+        <w:t xml:space="preserve"> </w:t>
+      </w:r>
+      <w:r>
+        <w:rPr>
+          <w:rFonts w:ascii="Times New Roman" w:hAnsi="Times New Roman" w:cs="Times New Roman"/>
+          <w:lang w:val="en-CA"/>
+        </w:rPr>
+        <w:t>±</w:t>
+      </w:r>
+      <w:r>
+        <w:rPr>
+          <w:rFonts w:ascii="Times New Roman" w:hAnsi="Times New Roman" w:cs="Times New Roman"/>
+          <w:lang w:val="en-CA"/>
+        </w:rPr>
+        <w:t xml:space="preserve"> </w:t>
+      </w:r>
+      <w:r>
+        <w:rPr>
+          <w:rFonts w:ascii="Times New Roman" w:hAnsi="Times New Roman" w:cs="Times New Roman"/>
+          <w:lang w:val="en-CA"/>
+        </w:rPr>
+        <w:t>0.090</w:t>
+      </w:r>
+      <w:r>
+        <w:rPr>
+          <w:rFonts w:ascii="Times New Roman" w:hAnsi="Times New Roman" w:cs="Times New Roman"/>
+          <w:lang w:val="en-CA"/>
+        </w:rPr>
+        <w:t>9)</w:t>
+      </w:r>
+      <w:r>
+        <w:rPr>
+          <w:rFonts w:ascii="Times New Roman" w:hAnsi="Times New Roman" w:cs="Times New Roman"/>
+        </w:rPr>
+        <w:t>. However, there was a larger effect of provisioning on primary productivity in field experiments with stocked consumers (</w:t>
+      </w:r>
+      <w:r>
+        <w:rPr>
+          <w:rFonts w:ascii="Times New Roman" w:hAnsi="Times New Roman" w:cs="Times New Roman"/>
+        </w:rPr>
+        <w:t>1.014</w:t>
+      </w:r>
+      <w:r>
+        <w:rPr>
+          <w:rFonts w:ascii="Times New Roman" w:hAnsi="Times New Roman" w:cs="Times New Roman"/>
+        </w:rPr>
+        <w:t xml:space="preserve">6 </w:t>
+      </w:r>
+      <w:r>
+        <w:rPr>
+          <w:rFonts w:ascii="Times New Roman" w:hAnsi="Times New Roman" w:cs="Times New Roman"/>
+          <w:lang w:val="en-CA"/>
+        </w:rPr>
+        <w:t>±</w:t>
+      </w:r>
+      <w:r>
+        <w:rPr>
+          <w:rFonts w:ascii="Times New Roman" w:hAnsi="Times New Roman" w:cs="Times New Roman"/>
+        </w:rPr>
+        <w:t xml:space="preserve"> </w:t>
+      </w:r>
+      <w:r>
+        <w:rPr>
+          <w:rFonts w:ascii="Times New Roman" w:hAnsi="Times New Roman" w:cs="Times New Roman"/>
+        </w:rPr>
+        <w:t>0.214</w:t>
+      </w:r>
+      <w:r>
+        <w:rPr>
+          <w:rFonts w:ascii="Times New Roman" w:hAnsi="Times New Roman" w:cs="Times New Roman"/>
+        </w:rPr>
+        <w:t>9) or stocked consumers and producers (</w:t>
+      </w:r>
+      <w:r>
+        <w:rPr>
+          <w:rFonts w:ascii="Times New Roman" w:hAnsi="Times New Roman" w:cs="Times New Roman"/>
+        </w:rPr>
+        <w:t>1.2062</w:t>
+      </w:r>
+      <w:r>
+        <w:rPr>
+          <w:rFonts w:ascii="Times New Roman" w:hAnsi="Times New Roman" w:cs="Times New Roman"/>
+        </w:rPr>
+        <w:t xml:space="preserve"> </w:t>
+      </w:r>
+      <w:r>
+        <w:rPr>
+          <w:rFonts w:ascii="Times New Roman" w:hAnsi="Times New Roman" w:cs="Times New Roman"/>
+          <w:lang w:val="en-CA"/>
+        </w:rPr>
+        <w:t>±</w:t>
+      </w:r>
+      <w:r>
+        <w:rPr>
+          <w:rFonts w:ascii="Times New Roman" w:hAnsi="Times New Roman" w:cs="Times New Roman"/>
+        </w:rPr>
+        <w:t xml:space="preserve"> </w:t>
+      </w:r>
+      <w:r>
+        <w:rPr>
+          <w:rFonts w:ascii="Times New Roman" w:hAnsi="Times New Roman" w:cs="Times New Roman"/>
+        </w:rPr>
+        <w:t>0.3119</w:t>
+      </w:r>
+      <w:r>
+        <w:rPr>
+          <w:rFonts w:ascii="Times New Roman" w:hAnsi="Times New Roman" w:cs="Times New Roman"/>
+        </w:rPr>
+        <w:t>,</w:t>
+      </w:r>
+      <w:r>
+        <w:rPr>
+          <w:rFonts w:ascii="Times New Roman" w:hAnsi="Times New Roman" w:cs="Times New Roman"/>
+          <w:lang w:val="en-CA"/>
+        </w:rPr>
+        <w:t xml:space="preserve"> </w:t>
+      </w:r>
+      <w:r>
+        <w:rPr>
+          <w:rFonts w:ascii="Times New Roman" w:hAnsi="Times New Roman" w:cs="Times New Roman"/>
+          <w:highlight w:val="yellow"/>
+          <w:lang w:val="en-CA"/>
+        </w:rPr>
+        <w:t>Fig. X</w:t>
+      </w:r>
+      <w:r>
+        <w:rPr>
+          <w:rFonts w:ascii="Times New Roman" w:hAnsi="Times New Roman" w:cs="Times New Roman"/>
+          <w:lang w:val="en-CA"/>
+        </w:rPr>
+        <w:t>).</w:t>
+      </w:r>
+    </w:p>
+    <w:p>
+      <w:pPr>
+        <w:spacing w:line="360" w:lineRule="auto"/>
+        <w:rPr>
+          <w:rFonts w:ascii="Times New Roman" w:hAnsi="Times New Roman" w:cs="Times New Roman"/>
+        </w:rPr>
+      </w:pPr>
+    </w:p>
+    <w:p>
+      <w:pPr>
+        <w:spacing w:line="360" w:lineRule="auto"/>
+        <w:rPr>
+          <w:rFonts w:ascii="Times New Roman" w:hAnsi="Times New Roman" w:cs="Times New Roman"/>
+        </w:rPr>
+      </w:pPr>
+      <w:r>
+        <w:rPr>
+          <w:rFonts w:ascii="Times New Roman" w:hAnsi="Times New Roman" w:cs="Times New Roman"/>
+        </w:rPr>
+        <w:t>Alternate models</w:t>
       </w:r>
     </w:p>
     <w:p>
@@ -5183,73 +6528,818 @@
           <w:rFonts w:ascii="Times New Roman" w:hAnsi="Times New Roman" w:cs="Times New Roman"/>
         </w:rPr>
       </w:pPr>
+      <w:r>
+        <w:rPr>
+          <w:rFonts w:ascii="Times New Roman" w:hAnsi="Times New Roman" w:cs="Times New Roman"/>
+        </w:rPr>
+        <w:t>We also found an overall positive effect of nutrient provisioning in the model including absolute latitude (</w:t>
+      </w:r>
+      <w:r>
+        <w:rPr>
+          <w:rFonts w:ascii="Times New Roman" w:hAnsi="Times New Roman" w:cs="Times New Roman"/>
+        </w:rPr>
+        <w:t>0.5944</w:t>
+      </w:r>
+      <w:r>
+        <w:rPr>
+          <w:rFonts w:ascii="Times New Roman" w:hAnsi="Times New Roman" w:cs="Times New Roman"/>
+        </w:rPr>
+        <w:t xml:space="preserve"> </w:t>
+      </w:r>
+      <w:r>
+        <w:rPr>
+          <w:rFonts w:ascii="Times New Roman" w:hAnsi="Times New Roman" w:cs="Times New Roman"/>
+          <w:lang w:val="en-CA"/>
+        </w:rPr>
+        <w:t>±</w:t>
+      </w:r>
+      <w:r>
+        <w:rPr>
+          <w:rFonts w:ascii="Times New Roman" w:hAnsi="Times New Roman" w:cs="Times New Roman"/>
+          <w:lang w:val="en-CA"/>
+        </w:rPr>
+        <w:t xml:space="preserve"> </w:t>
+      </w:r>
+      <w:r>
+        <w:rPr>
+          <w:rFonts w:ascii="Times New Roman" w:hAnsi="Times New Roman" w:cs="Times New Roman"/>
+          <w:lang w:val="en-CA"/>
+        </w:rPr>
+        <w:t>0.1618</w:t>
+      </w:r>
+      <w:r>
+        <w:rPr>
+          <w:rFonts w:ascii="Times New Roman" w:hAnsi="Times New Roman" w:cs="Times New Roman"/>
+          <w:lang w:val="en-CA"/>
+        </w:rPr>
+        <w:t xml:space="preserve">, p = </w:t>
+      </w:r>
+      <w:r>
+        <w:rPr>
+          <w:rFonts w:ascii="Times New Roman" w:hAnsi="Times New Roman" w:cs="Times New Roman"/>
+          <w:lang w:val="en-CA"/>
+        </w:rPr>
+        <w:t>0.0003</w:t>
+      </w:r>
+      <w:r>
+        <w:rPr>
+          <w:rFonts w:ascii="Times New Roman" w:hAnsi="Times New Roman" w:cs="Times New Roman"/>
+          <w:lang w:val="en-CA"/>
+        </w:rPr>
+        <w:t>)</w:t>
+      </w:r>
+      <w:r>
+        <w:rPr>
+          <w:rFonts w:ascii="Times New Roman" w:hAnsi="Times New Roman" w:cs="Times New Roman"/>
+          <w:lang w:val="en-CA"/>
+        </w:rPr>
+        <w:t xml:space="preserve">, however </w:t>
+      </w:r>
+      <w:r>
+        <w:rPr>
+          <w:rFonts w:ascii="Times New Roman" w:hAnsi="Times New Roman" w:cs="Times New Roman"/>
+        </w:rPr>
+        <w:t>t</w:t>
+      </w:r>
+      <w:r>
+        <w:rPr>
+          <w:rFonts w:ascii="Times New Roman" w:hAnsi="Times New Roman" w:cs="Times New Roman"/>
+        </w:rPr>
+        <w:t>here was no evidence that the effect of nutrient provisioning varies by absolute latitude (</w:t>
+      </w:r>
+      <w:r>
+        <w:rPr>
+          <w:rFonts w:ascii="Times New Roman" w:hAnsi="Times New Roman" w:cs="Times New Roman"/>
+        </w:rPr>
+        <w:t xml:space="preserve">0.0149 </w:t>
+      </w:r>
+      <w:r>
+        <w:rPr>
+          <w:rFonts w:ascii="Times New Roman" w:hAnsi="Times New Roman" w:cs="Times New Roman"/>
+        </w:rPr>
+        <w:t xml:space="preserve">± </w:t>
+      </w:r>
+      <w:r>
+        <w:rPr>
+          <w:rFonts w:ascii="Times New Roman" w:hAnsi="Times New Roman" w:cs="Times New Roman"/>
+        </w:rPr>
+        <w:t>0.0794</w:t>
+      </w:r>
+      <w:r>
+        <w:rPr>
+          <w:rFonts w:ascii="Times New Roman" w:hAnsi="Times New Roman" w:cs="Times New Roman"/>
+        </w:rPr>
+        <w:t xml:space="preserve">, p = </w:t>
+      </w:r>
+      <w:r>
+        <w:rPr>
+          <w:rFonts w:ascii="Times New Roman" w:hAnsi="Times New Roman" w:cs="Times New Roman"/>
+        </w:rPr>
+        <w:t>0.8513</w:t>
+      </w:r>
+      <w:r>
+        <w:rPr>
+          <w:rFonts w:ascii="Times New Roman" w:hAnsi="Times New Roman" w:cs="Times New Roman"/>
+        </w:rPr>
+        <w:t>)</w:t>
+      </w:r>
+      <w:r>
+        <w:rPr>
+          <w:rFonts w:ascii="Times New Roman" w:hAnsi="Times New Roman" w:cs="Times New Roman"/>
+          <w:lang w:val="en-CA"/>
+        </w:rPr>
+        <w:t xml:space="preserve">. There was weak support for this model over a null model </w:t>
+      </w:r>
+      <w:proofErr w:type="gramStart"/>
+      <w:r>
+        <w:rPr>
+          <w:rFonts w:ascii="Times New Roman" w:hAnsi="Times New Roman" w:cs="Times New Roman"/>
+          <w:lang w:val="en-CA"/>
+        </w:rPr>
+        <w:t>F</w:t>
+      </w:r>
+      <w:r>
+        <w:rPr>
+          <w:rFonts w:ascii="Times New Roman" w:hAnsi="Times New Roman" w:cs="Times New Roman"/>
+          <w:vertAlign w:val="subscript"/>
+          <w:lang w:val="en-CA"/>
+        </w:rPr>
+        <w:t>(</w:t>
+      </w:r>
+      <w:proofErr w:type="gramEnd"/>
+      <w:r>
+        <w:rPr>
+          <w:rFonts w:ascii="Times New Roman" w:hAnsi="Times New Roman" w:cs="Times New Roman"/>
+          <w:vertAlign w:val="subscript"/>
+          <w:lang w:val="en-CA"/>
+        </w:rPr>
+        <w:t>8, 163)</w:t>
+      </w:r>
+      <w:r>
+        <w:rPr>
+          <w:rFonts w:ascii="Times New Roman" w:hAnsi="Times New Roman" w:cs="Times New Roman"/>
+          <w:lang w:val="en-CA"/>
+        </w:rPr>
+        <w:t xml:space="preserve"> = 1.7040, p</w:t>
+      </w:r>
+      <w:r>
+        <w:rPr>
+          <w:rFonts w:ascii="Times New Roman" w:hAnsi="Times New Roman" w:cs="Times New Roman"/>
+          <w:lang w:val="en-CA"/>
+        </w:rPr>
+        <w:t xml:space="preserve"> </w:t>
+      </w:r>
+      <w:r>
+        <w:rPr>
+          <w:rFonts w:ascii="Times New Roman" w:hAnsi="Times New Roman" w:cs="Times New Roman"/>
+          <w:lang w:val="en-CA"/>
+        </w:rPr>
+        <w:t>= 0.1010</w:t>
+      </w:r>
+      <w:r>
+        <w:rPr>
+          <w:rFonts w:ascii="Times New Roman" w:hAnsi="Times New Roman" w:cs="Times New Roman"/>
+          <w:lang w:val="en-CA"/>
+        </w:rPr>
+        <w:t xml:space="preserve">), and a significant amount of unexplained residual </w:t>
+      </w:r>
+      <w:r>
+        <w:rPr>
+          <w:rFonts w:ascii="Times New Roman" w:hAnsi="Times New Roman" w:cs="Times New Roman"/>
+        </w:rPr>
+        <w:t>h</w:t>
+      </w:r>
+      <w:r>
+        <w:rPr>
+          <w:rFonts w:ascii="Times New Roman" w:hAnsi="Times New Roman" w:cs="Times New Roman"/>
+        </w:rPr>
+        <w:t>eterogeneity</w:t>
+      </w:r>
+      <w:r>
+        <w:rPr>
+          <w:rFonts w:ascii="Times New Roman" w:hAnsi="Times New Roman" w:cs="Times New Roman"/>
+        </w:rPr>
+        <w:t xml:space="preserve"> (</w:t>
+      </w:r>
+      <w:r>
+        <w:rPr>
+          <w:rFonts w:ascii="Times New Roman" w:hAnsi="Times New Roman" w:cs="Times New Roman"/>
+        </w:rPr>
+        <w:t>QE</w:t>
+      </w:r>
+      <w:r>
+        <w:rPr>
+          <w:rFonts w:ascii="Times New Roman" w:hAnsi="Times New Roman" w:cs="Times New Roman"/>
+          <w:vertAlign w:val="subscript"/>
+        </w:rPr>
+        <w:t>163</w:t>
+      </w:r>
+      <w:r>
+        <w:rPr>
+          <w:rFonts w:ascii="Times New Roman" w:hAnsi="Times New Roman" w:cs="Times New Roman"/>
+        </w:rPr>
+        <w:t xml:space="preserve"> = 2974.5395, p &lt; </w:t>
+      </w:r>
+      <w:r>
+        <w:rPr>
+          <w:rFonts w:ascii="Times New Roman" w:hAnsi="Times New Roman" w:cs="Times New Roman"/>
+        </w:rPr>
+        <w:t>0</w:t>
+      </w:r>
+      <w:r>
+        <w:rPr>
+          <w:rFonts w:ascii="Times New Roman" w:hAnsi="Times New Roman" w:cs="Times New Roman"/>
+        </w:rPr>
+        <w:t>.0001</w:t>
+      </w:r>
+      <w:r>
+        <w:rPr>
+          <w:rFonts w:ascii="Times New Roman" w:hAnsi="Times New Roman" w:cs="Times New Roman"/>
+        </w:rPr>
+        <w:t>). The model including temperature also showed a positive effect of nutrient provisioning (</w:t>
+      </w:r>
+      <w:r>
+        <w:rPr>
+          <w:rFonts w:ascii="Times New Roman" w:hAnsi="Times New Roman" w:cs="Times New Roman"/>
+        </w:rPr>
+        <w:t>0.5816</w:t>
+      </w:r>
+      <w:r>
+        <w:rPr>
+          <w:rFonts w:ascii="Times New Roman" w:hAnsi="Times New Roman" w:cs="Times New Roman"/>
+        </w:rPr>
+        <w:t xml:space="preserve"> </w:t>
+      </w:r>
+      <w:r>
+        <w:rPr>
+          <w:rFonts w:ascii="Times New Roman" w:hAnsi="Times New Roman" w:cs="Times New Roman"/>
+        </w:rPr>
+        <w:t xml:space="preserve">± </w:t>
+      </w:r>
+      <w:r>
+        <w:rPr>
+          <w:rFonts w:ascii="Times New Roman" w:hAnsi="Times New Roman" w:cs="Times New Roman"/>
+        </w:rPr>
+        <w:t>0.1617</w:t>
+      </w:r>
+      <w:r>
+        <w:rPr>
+          <w:rFonts w:ascii="Times New Roman" w:hAnsi="Times New Roman" w:cs="Times New Roman"/>
+        </w:rPr>
+        <w:t xml:space="preserve">, p = </w:t>
+      </w:r>
+      <w:r>
+        <w:rPr>
+          <w:rFonts w:ascii="Times New Roman" w:hAnsi="Times New Roman" w:cs="Times New Roman"/>
+        </w:rPr>
+        <w:t>0.0004</w:t>
+      </w:r>
+      <w:r>
+        <w:rPr>
+          <w:rFonts w:ascii="Times New Roman" w:hAnsi="Times New Roman" w:cs="Times New Roman"/>
+        </w:rPr>
+        <w:t>), but w</w:t>
+      </w:r>
+      <w:r>
+        <w:rPr>
+          <w:rFonts w:ascii="Times New Roman" w:hAnsi="Times New Roman" w:cs="Times New Roman"/>
+        </w:rPr>
+        <w:t>e found no evidence that the effect of provisioned nutrients varies with temperature (</w:t>
+      </w:r>
+      <w:r>
+        <w:rPr>
+          <w:rFonts w:ascii="Times New Roman" w:hAnsi="Times New Roman" w:cs="Times New Roman"/>
+        </w:rPr>
+        <w:t>-0.0551</w:t>
+      </w:r>
+      <w:r>
+        <w:rPr>
+          <w:rFonts w:ascii="Times New Roman" w:hAnsi="Times New Roman" w:cs="Times New Roman"/>
+        </w:rPr>
+        <w:t xml:space="preserve"> ± </w:t>
+      </w:r>
+      <w:r>
+        <w:rPr>
+          <w:rFonts w:ascii="Times New Roman" w:hAnsi="Times New Roman" w:cs="Times New Roman"/>
+        </w:rPr>
+        <w:t>0.0729</w:t>
+      </w:r>
+      <w:r>
+        <w:rPr>
+          <w:rFonts w:ascii="Times New Roman" w:hAnsi="Times New Roman" w:cs="Times New Roman"/>
+        </w:rPr>
+        <w:t xml:space="preserve">, p = </w:t>
+      </w:r>
+      <w:r>
+        <w:rPr>
+          <w:rFonts w:ascii="Times New Roman" w:hAnsi="Times New Roman" w:cs="Times New Roman"/>
+        </w:rPr>
+        <w:t>0.4508</w:t>
+      </w:r>
+      <w:r>
+        <w:rPr>
+          <w:rFonts w:ascii="Times New Roman" w:hAnsi="Times New Roman" w:cs="Times New Roman"/>
+        </w:rPr>
+        <w:t>).</w:t>
+      </w:r>
+      <w:r>
+        <w:rPr>
+          <w:rFonts w:ascii="Times New Roman" w:hAnsi="Times New Roman" w:cs="Times New Roman"/>
+        </w:rPr>
+        <w:t xml:space="preserve"> This model was preferred over a null model (</w:t>
+      </w:r>
+      <w:proofErr w:type="gramStart"/>
+      <w:r>
+        <w:rPr>
+          <w:rFonts w:ascii="Times New Roman" w:hAnsi="Times New Roman" w:cs="Times New Roman"/>
+        </w:rPr>
+        <w:t>F</w:t>
+      </w:r>
+      <w:r>
+        <w:rPr>
+          <w:rFonts w:ascii="Times New Roman" w:hAnsi="Times New Roman" w:cs="Times New Roman"/>
+          <w:vertAlign w:val="subscript"/>
+        </w:rPr>
+        <w:t>(</w:t>
+      </w:r>
+      <w:proofErr w:type="gramEnd"/>
+      <w:r>
+        <w:rPr>
+          <w:rFonts w:ascii="Times New Roman" w:hAnsi="Times New Roman" w:cs="Times New Roman"/>
+          <w:vertAlign w:val="subscript"/>
+        </w:rPr>
+        <w:t>8,163)</w:t>
+      </w:r>
+      <w:r>
+        <w:rPr>
+          <w:rFonts w:ascii="Times New Roman" w:hAnsi="Times New Roman" w:cs="Times New Roman"/>
+        </w:rPr>
+        <w:t xml:space="preserve"> = 1.7828, p</w:t>
+      </w:r>
+      <w:r>
+        <w:rPr>
+          <w:rFonts w:ascii="Times New Roman" w:hAnsi="Times New Roman" w:cs="Times New Roman"/>
+        </w:rPr>
+        <w:t xml:space="preserve"> </w:t>
+      </w:r>
+      <w:r>
+        <w:rPr>
+          <w:rFonts w:ascii="Times New Roman" w:hAnsi="Times New Roman" w:cs="Times New Roman"/>
+        </w:rPr>
+        <w:t>= 0.0838</w:t>
+      </w:r>
+      <w:r>
+        <w:rPr>
+          <w:rFonts w:ascii="Times New Roman" w:hAnsi="Times New Roman" w:cs="Times New Roman"/>
+        </w:rPr>
+        <w:t xml:space="preserve">), but there was still a significant amount of </w:t>
+      </w:r>
+      <w:r>
+        <w:rPr>
+          <w:rFonts w:ascii="Times New Roman" w:hAnsi="Times New Roman" w:cs="Times New Roman"/>
+          <w:lang w:val="en-CA"/>
+        </w:rPr>
+        <w:t xml:space="preserve">unexplained residual </w:t>
+      </w:r>
+      <w:r>
+        <w:rPr>
+          <w:rFonts w:ascii="Times New Roman" w:hAnsi="Times New Roman" w:cs="Times New Roman"/>
+        </w:rPr>
+        <w:t>h</w:t>
+      </w:r>
+      <w:r>
+        <w:rPr>
+          <w:rFonts w:ascii="Times New Roman" w:hAnsi="Times New Roman" w:cs="Times New Roman"/>
+        </w:rPr>
+        <w:t>eterogeneity</w:t>
+      </w:r>
+      <w:r>
+        <w:t xml:space="preserve"> </w:t>
+      </w:r>
+      <w:r>
+        <w:rPr>
+          <w:rFonts w:ascii="Times New Roman" w:hAnsi="Times New Roman" w:cs="Times New Roman"/>
+        </w:rPr>
+        <w:t>QE</w:t>
+      </w:r>
+      <w:r>
+        <w:rPr>
+          <w:rFonts w:ascii="Times New Roman" w:hAnsi="Times New Roman" w:cs="Times New Roman"/>
+          <w:vertAlign w:val="subscript"/>
+        </w:rPr>
+        <w:t>163</w:t>
+      </w:r>
+      <w:r>
+        <w:rPr>
+          <w:rFonts w:ascii="Times New Roman" w:hAnsi="Times New Roman" w:cs="Times New Roman"/>
+        </w:rPr>
+        <w:t xml:space="preserve"> = 3006.2277, p &lt; </w:t>
+      </w:r>
+      <w:r>
+        <w:rPr>
+          <w:rFonts w:ascii="Times New Roman" w:hAnsi="Times New Roman" w:cs="Times New Roman"/>
+        </w:rPr>
+        <w:t>0</w:t>
+      </w:r>
+      <w:r>
+        <w:rPr>
+          <w:rFonts w:ascii="Times New Roman" w:hAnsi="Times New Roman" w:cs="Times New Roman"/>
+        </w:rPr>
+        <w:t>.0001</w:t>
+      </w:r>
+      <w:r>
+        <w:rPr>
+          <w:rFonts w:ascii="Times New Roman" w:hAnsi="Times New Roman" w:cs="Times New Roman"/>
+        </w:rPr>
+        <w:t>). For both these models t</w:t>
+      </w:r>
+      <w:r>
+        <w:rPr>
+          <w:rFonts w:ascii="Times New Roman" w:hAnsi="Times New Roman" w:cs="Times New Roman"/>
+        </w:rPr>
+        <w:t>he differences between levels in the categorical moderators (experimental design and primary producer) were roughly the same in magnitude and significance as in the model including background nutrients (</w:t>
+      </w:r>
+      <w:r>
+        <w:rPr>
+          <w:rFonts w:ascii="Times New Roman" w:hAnsi="Times New Roman" w:cs="Times New Roman"/>
+          <w:highlight w:val="yellow"/>
+        </w:rPr>
+        <w:t>Supplement</w:t>
+      </w:r>
+      <w:r>
+        <w:rPr>
+          <w:rFonts w:ascii="Times New Roman" w:hAnsi="Times New Roman" w:cs="Times New Roman"/>
+          <w:highlight w:val="yellow"/>
+        </w:rPr>
+        <w:t>al table X</w:t>
+      </w:r>
+      <w:r>
+        <w:rPr>
+          <w:rFonts w:ascii="Times New Roman" w:hAnsi="Times New Roman" w:cs="Times New Roman"/>
+        </w:rPr>
+        <w:t>).</w:t>
+      </w:r>
     </w:p>
     <w:p>
       <w:pPr>
         <w:spacing w:line="360" w:lineRule="auto"/>
-        <w:ind w:firstLine="720"/>
-        <w:rPr>
-          <w:rFonts w:ascii="Times New Roman" w:hAnsi="Times New Roman" w:cs="Times New Roman"/>
-        </w:rPr>
-      </w:pPr>
-      <w:r>
-        <w:rPr>
-          <w:rFonts w:ascii="Times New Roman" w:hAnsi="Times New Roman" w:cs="Times New Roman"/>
+        <w:rPr>
+          <w:rFonts w:ascii="Times New Roman" w:hAnsi="Times New Roman" w:cs="Times New Roman"/>
+        </w:rPr>
+      </w:pPr>
+      <w:r>
+        <w:rPr>
+          <w:rFonts w:ascii="Times New Roman" w:hAnsi="Times New Roman" w:cs="Times New Roman"/>
+          <w:noProof/>
         </w:rPr>
         <w:lastRenderedPageBreak/>
+        <w:drawing>
+          <wp:inline distT="0" distB="0" distL="0" distR="0" wp14:anchorId="620E55D3" wp14:editId="426CEECA">
+            <wp:extent cx="4493310" cy="2527487"/>
+            <wp:effectExtent l="0" t="0" r="2540" b="0"/>
+            <wp:docPr id="1" name="Picture 1"/>
+            <wp:cNvGraphicFramePr>
+              <a:graphicFrameLocks xmlns:a="http://schemas.openxmlformats.org/drawingml/2006/main" noChangeAspect="1"/>
+            </wp:cNvGraphicFramePr>
+            <a:graphic xmlns:a="http://schemas.openxmlformats.org/drawingml/2006/main">
+              <a:graphicData uri="http://schemas.openxmlformats.org/drawingml/2006/picture">
+                <pic:pic xmlns:pic="http://schemas.openxmlformats.org/drawingml/2006/picture">
+                  <pic:nvPicPr>
+                    <pic:cNvPr id="1" name="pp_effect.png"/>
+                    <pic:cNvPicPr/>
+                  </pic:nvPicPr>
+                  <pic:blipFill>
+                    <a:blip r:embed="rId10">
+                      <a:extLst>
+                        <a:ext uri="{28A0092B-C50C-407E-A947-70E740481C1C}">
+                          <a14:useLocalDpi xmlns:a14="http://schemas.microsoft.com/office/drawing/2010/main" val="0"/>
+                        </a:ext>
+                      </a:extLst>
+                    </a:blip>
+                    <a:stretch>
+                      <a:fillRect/>
+                    </a:stretch>
+                  </pic:blipFill>
+                  <pic:spPr>
+                    <a:xfrm>
+                      <a:off x="0" y="0"/>
+                      <a:ext cx="4498261" cy="2530272"/>
+                    </a:xfrm>
+                    <a:prstGeom prst="rect">
+                      <a:avLst/>
+                    </a:prstGeom>
+                  </pic:spPr>
+                </pic:pic>
+              </a:graphicData>
+            </a:graphic>
+          </wp:inline>
+        </w:drawing>
+      </w:r>
+    </w:p>
+    <w:p>
+      <w:pPr>
+        <w:spacing w:line="360" w:lineRule="auto"/>
+        <w:rPr>
+          <w:rFonts w:ascii="Times New Roman" w:hAnsi="Times New Roman" w:cs="Times New Roman"/>
+        </w:rPr>
+      </w:pPr>
+      <w:r>
+        <w:rPr>
+          <w:rFonts w:ascii="Times New Roman" w:hAnsi="Times New Roman" w:cs="Times New Roman"/>
+          <w:highlight w:val="yellow"/>
+        </w:rPr>
+        <w:t>Fig. X</w:t>
+      </w:r>
+      <w:r>
+        <w:rPr>
+          <w:rFonts w:ascii="Times New Roman" w:hAnsi="Times New Roman" w:cs="Times New Roman"/>
+        </w:rPr>
+        <w:t xml:space="preserve">. Effect of animal-provisioned nutrients on different categories of primary producer. Plants include seagrasses and mangroves, phytoplankton include micro algae, coral includes measurements of both corals and coral endosymbionts, and algae includes fleshy and crustose algae. Effect sizes are </w:t>
+      </w:r>
+      <w:r>
+        <w:rPr>
+          <w:rFonts w:ascii="Times New Roman" w:hAnsi="Times New Roman" w:cs="Times New Roman"/>
+          <w:lang w:val="en-CA"/>
+        </w:rPr>
+        <w:t>log transformed ratio of means</w:t>
+      </w:r>
+      <w:r>
+        <w:rPr>
+          <w:rFonts w:ascii="Times New Roman" w:hAnsi="Times New Roman" w:cs="Times New Roman"/>
+          <w:lang w:val="en-CA"/>
+        </w:rPr>
+        <w:t xml:space="preserve"> surrounded by 95% confidence intervals derived from the </w:t>
+      </w:r>
+      <w:r>
+        <w:rPr>
+          <w:rFonts w:ascii="Times New Roman" w:hAnsi="Times New Roman" w:cs="Times New Roman"/>
+        </w:rPr>
+        <w:t>three-level mixed effects model</w:t>
+      </w:r>
+      <w:r>
+        <w:rPr>
+          <w:rFonts w:ascii="Times New Roman" w:hAnsi="Times New Roman" w:cs="Times New Roman"/>
+        </w:rPr>
+        <w:t xml:space="preserve"> including background nutrients, primary producer, and experimental design as moderators.</w:t>
+      </w:r>
+      <w:r>
+        <w:rPr>
+          <w:rFonts w:ascii="Times New Roman" w:hAnsi="Times New Roman" w:cs="Times New Roman"/>
+        </w:rPr>
         <w:t xml:space="preserve"> </w:t>
       </w:r>
       <w:r>
         <w:rPr>
           <w:rFonts w:ascii="Times New Roman" w:hAnsi="Times New Roman" w:cs="Times New Roman"/>
         </w:rPr>
-        <w:t xml:space="preserve">We </w:t>
-      </w:r>
-      <w:r>
-        <w:rPr>
-          <w:rFonts w:ascii="Times New Roman" w:hAnsi="Times New Roman" w:cs="Times New Roman"/>
-        </w:rPr>
-        <w:t>determined that</w:t>
-      </w:r>
-      <w:r>
-        <w:rPr>
-          <w:rFonts w:ascii="Times New Roman" w:hAnsi="Times New Roman" w:cs="Times New Roman"/>
-        </w:rPr>
-        <w:t xml:space="preserve"> absolute latitude, temperature, and background nutrients are correlated</w:t>
-      </w:r>
-      <w:r>
-        <w:rPr>
-          <w:rFonts w:ascii="Times New Roman" w:hAnsi="Times New Roman" w:cs="Times New Roman"/>
-        </w:rPr>
-        <w:t xml:space="preserve"> using a correlation matrix</w:t>
-      </w:r>
-      <w:r>
-        <w:rPr>
-          <w:rFonts w:ascii="Times New Roman" w:hAnsi="Times New Roman" w:cs="Times New Roman"/>
-        </w:rPr>
-        <w:t xml:space="preserve"> (</w:t>
-      </w:r>
-      <w:proofErr w:type="gramStart"/>
-      <w:r>
-        <w:rPr>
-          <w:rFonts w:ascii="Times New Roman" w:hAnsi="Times New Roman" w:cs="Times New Roman"/>
-        </w:rPr>
-        <w:t>metaphor::</w:t>
+        <w:t>Sample sizes within each group are shown to the right of the effect sizes.</w:t>
+      </w:r>
+    </w:p>
+    <w:p>
+      <w:pPr>
+        <w:spacing w:line="360" w:lineRule="auto"/>
+        <w:rPr>
+          <w:rFonts w:ascii="Times New Roman" w:hAnsi="Times New Roman" w:cs="Times New Roman"/>
+        </w:rPr>
+      </w:pPr>
+    </w:p>
+    <w:p>
+      <w:pPr>
+        <w:spacing w:line="360" w:lineRule="auto"/>
+        <w:rPr>
+          <w:rFonts w:ascii="Times New Roman" w:hAnsi="Times New Roman" w:cs="Times New Roman"/>
+        </w:rPr>
+      </w:pPr>
+      <w:r>
+        <w:rPr>
+          <w:rFonts w:ascii="Times New Roman" w:hAnsi="Times New Roman" w:cs="Times New Roman"/>
+          <w:noProof/>
+        </w:rPr>
+        <w:drawing>
+          <wp:inline distT="0" distB="0" distL="0" distR="0" wp14:anchorId="6BAFA11A" wp14:editId="530DDECB">
+            <wp:extent cx="4688541" cy="2637304"/>
+            <wp:effectExtent l="0" t="0" r="0" b="4445"/>
+            <wp:docPr id="2" name="Picture 2"/>
+            <wp:cNvGraphicFramePr>
+              <a:graphicFrameLocks xmlns:a="http://schemas.openxmlformats.org/drawingml/2006/main" noChangeAspect="1"/>
+            </wp:cNvGraphicFramePr>
+            <a:graphic xmlns:a="http://schemas.openxmlformats.org/drawingml/2006/main">
+              <a:graphicData uri="http://schemas.openxmlformats.org/drawingml/2006/picture">
+                <pic:pic xmlns:pic="http://schemas.openxmlformats.org/drawingml/2006/picture">
+                  <pic:nvPicPr>
+                    <pic:cNvPr id="2" name="nat_effect.png"/>
+                    <pic:cNvPicPr/>
+                  </pic:nvPicPr>
+                  <pic:blipFill>
+                    <a:blip r:embed="rId11">
+                      <a:extLst>
+                        <a:ext uri="{28A0092B-C50C-407E-A947-70E740481C1C}">
+                          <a14:useLocalDpi xmlns:a14="http://schemas.microsoft.com/office/drawing/2010/main" val="0"/>
+                        </a:ext>
+                      </a:extLst>
+                    </a:blip>
+                    <a:stretch>
+                      <a:fillRect/>
+                    </a:stretch>
+                  </pic:blipFill>
+                  <pic:spPr>
+                    <a:xfrm>
+                      <a:off x="0" y="0"/>
+                      <a:ext cx="4723039" cy="2656709"/>
+                    </a:xfrm>
+                    <a:prstGeom prst="rect">
+                      <a:avLst/>
+                    </a:prstGeom>
+                  </pic:spPr>
+                </pic:pic>
+              </a:graphicData>
+            </a:graphic>
+          </wp:inline>
+        </w:drawing>
+      </w:r>
+    </w:p>
+    <w:p>
+      <w:pPr>
+        <w:spacing w:line="360" w:lineRule="auto"/>
+        <w:rPr>
+          <w:rFonts w:ascii="Times New Roman" w:hAnsi="Times New Roman" w:cs="Times New Roman"/>
+        </w:rPr>
+      </w:pPr>
+      <w:r>
+        <w:rPr>
+          <w:rFonts w:ascii="Times New Roman" w:hAnsi="Times New Roman" w:cs="Times New Roman"/>
+          <w:highlight w:val="yellow"/>
+        </w:rPr>
+        <w:t>Fig. X</w:t>
+      </w:r>
+      <w:r>
+        <w:rPr>
+          <w:rFonts w:ascii="Times New Roman" w:hAnsi="Times New Roman" w:cs="Times New Roman"/>
+        </w:rPr>
+        <w:t xml:space="preserve">. Effect of animal-provisioned nutrients on different categories of </w:t>
+      </w:r>
+      <w:r>
+        <w:rPr>
+          <w:rFonts w:ascii="Times New Roman" w:hAnsi="Times New Roman" w:cs="Times New Roman"/>
+        </w:rPr>
+        <w:t>experimental design</w:t>
+      </w:r>
+      <w:r>
+        <w:rPr>
+          <w:rFonts w:ascii="Times New Roman" w:hAnsi="Times New Roman" w:cs="Times New Roman"/>
+        </w:rPr>
+        <w:t xml:space="preserve">. </w:t>
+      </w:r>
+      <w:r>
+        <w:rPr>
+          <w:rFonts w:ascii="Times New Roman" w:hAnsi="Times New Roman" w:cs="Times New Roman"/>
+        </w:rPr>
+        <w:t>Field experiments were split based on whether the researchers set the density of the primary producer (PP stocked), consumer (animals stocked), both, or neither (</w:t>
       </w:r>
       <w:proofErr w:type="spellStart"/>
-      <w:proofErr w:type="gramEnd"/>
-      <w:r>
-        <w:rPr>
-          <w:rFonts w:ascii="Times New Roman" w:hAnsi="Times New Roman" w:cs="Times New Roman"/>
-        </w:rPr>
-        <w:t>vif</w:t>
+      <w:r>
+        <w:rPr>
+          <w:rFonts w:ascii="Times New Roman" w:hAnsi="Times New Roman" w:cs="Times New Roman"/>
+        </w:rPr>
+        <w:t>unstocked</w:t>
       </w:r>
       <w:proofErr w:type="spellEnd"/>
       <w:r>
         <w:rPr>
           <w:rFonts w:ascii="Times New Roman" w:hAnsi="Times New Roman" w:cs="Times New Roman"/>
         </w:rPr>
-        <w:t>)</w:t>
+        <w:t>).</w:t>
+      </w:r>
+      <w:r>
+        <w:rPr>
+          <w:rFonts w:ascii="Times New Roman" w:hAnsi="Times New Roman" w:cs="Times New Roman"/>
+        </w:rPr>
+        <w:t xml:space="preserve"> Effect sizes are </w:t>
+      </w:r>
+      <w:r>
+        <w:rPr>
+          <w:rFonts w:ascii="Times New Roman" w:hAnsi="Times New Roman" w:cs="Times New Roman"/>
+          <w:lang w:val="en-CA"/>
+        </w:rPr>
+        <w:lastRenderedPageBreak/>
+        <w:t>log transformed ratio of means</w:t>
+      </w:r>
+      <w:r>
+        <w:rPr>
+          <w:rFonts w:ascii="Times New Roman" w:hAnsi="Times New Roman" w:cs="Times New Roman"/>
+          <w:lang w:val="en-CA"/>
+        </w:rPr>
+        <w:t xml:space="preserve"> surrounded by 95% confidence intervals derived from the </w:t>
+      </w:r>
+      <w:r>
+        <w:rPr>
+          <w:rFonts w:ascii="Times New Roman" w:hAnsi="Times New Roman" w:cs="Times New Roman"/>
+        </w:rPr>
+        <w:t>three-level mixed effects model including background nutrients, primary producer, and experimental design as moderators.</w:t>
+      </w:r>
+      <w:r>
+        <w:rPr>
+          <w:rFonts w:ascii="Times New Roman" w:hAnsi="Times New Roman" w:cs="Times New Roman"/>
+        </w:rPr>
+        <w:t xml:space="preserve"> Sample sizes within each group are shown to the right of the effect sizes.</w:t>
+      </w:r>
+    </w:p>
+    <w:p>
+      <w:pPr>
+        <w:spacing w:line="360" w:lineRule="auto"/>
+        <w:rPr>
+          <w:rFonts w:ascii="Times New Roman" w:hAnsi="Times New Roman" w:cs="Times New Roman"/>
+        </w:rPr>
+      </w:pPr>
+      <w:bookmarkStart w:id="12" w:name="_GoBack"/>
+      <w:bookmarkEnd w:id="12"/>
+    </w:p>
+    <w:p>
+      <w:pPr>
+        <w:spacing w:line="360" w:lineRule="auto"/>
+        <w:rPr>
+          <w:rFonts w:ascii="Times New Roman" w:hAnsi="Times New Roman" w:cs="Times New Roman"/>
+        </w:rPr>
+      </w:pPr>
+      <w:r>
+        <w:rPr>
+          <w:rFonts w:ascii="Times New Roman" w:hAnsi="Times New Roman" w:cs="Times New Roman"/>
+          <w:noProof/>
+        </w:rPr>
+        <w:drawing>
+          <wp:inline distT="0" distB="0" distL="0" distR="0" wp14:anchorId="4C0C3D37" wp14:editId="6E602DCD">
+            <wp:extent cx="5943600" cy="3343275"/>
+            <wp:effectExtent l="0" t="0" r="0" b="0"/>
+            <wp:docPr id="3" name="Picture 3"/>
+            <wp:cNvGraphicFramePr>
+              <a:graphicFrameLocks xmlns:a="http://schemas.openxmlformats.org/drawingml/2006/main" noChangeAspect="1"/>
+            </wp:cNvGraphicFramePr>
+            <a:graphic xmlns:a="http://schemas.openxmlformats.org/drawingml/2006/main">
+              <a:graphicData uri="http://schemas.openxmlformats.org/drawingml/2006/picture">
+                <pic:pic xmlns:pic="http://schemas.openxmlformats.org/drawingml/2006/picture">
+                  <pic:nvPicPr>
+                    <pic:cNvPr id="3" name="cont_effects.png"/>
+                    <pic:cNvPicPr/>
+                  </pic:nvPicPr>
+                  <pic:blipFill>
+                    <a:blip r:embed="rId12">
+                      <a:extLst>
+                        <a:ext uri="{28A0092B-C50C-407E-A947-70E740481C1C}">
+                          <a14:useLocalDpi xmlns:a14="http://schemas.microsoft.com/office/drawing/2010/main" val="0"/>
+                        </a:ext>
+                      </a:extLst>
+                    </a:blip>
+                    <a:stretch>
+                      <a:fillRect/>
+                    </a:stretch>
+                  </pic:blipFill>
+                  <pic:spPr>
+                    <a:xfrm>
+                      <a:off x="0" y="0"/>
+                      <a:ext cx="5943600" cy="3343275"/>
+                    </a:xfrm>
+                    <a:prstGeom prst="rect">
+                      <a:avLst/>
+                    </a:prstGeom>
+                  </pic:spPr>
+                </pic:pic>
+              </a:graphicData>
+            </a:graphic>
+          </wp:inline>
+        </w:drawing>
+      </w:r>
+    </w:p>
+    <w:p>
+      <w:pPr>
+        <w:spacing w:line="360" w:lineRule="auto"/>
+        <w:rPr>
+          <w:rFonts w:ascii="Times New Roman" w:hAnsi="Times New Roman" w:cs="Times New Roman"/>
+        </w:rPr>
+      </w:pPr>
+      <w:r>
+        <w:rPr>
+          <w:rFonts w:ascii="Times New Roman" w:hAnsi="Times New Roman" w:cs="Times New Roman"/>
+          <w:highlight w:val="yellow"/>
+        </w:rPr>
+        <w:t>Fig. X.</w:t>
+      </w:r>
+      <w:r>
+        <w:rPr>
+          <w:rFonts w:ascii="Times New Roman" w:hAnsi="Times New Roman" w:cs="Times New Roman"/>
+        </w:rPr>
+        <w:t xml:space="preserve"> Effect of a) background nutrients, b) absolute latitude, and c) temperature</w:t>
+      </w:r>
+      <w:r>
+        <w:rPr>
+          <w:rFonts w:ascii="Times New Roman" w:hAnsi="Times New Roman" w:cs="Times New Roman"/>
+        </w:rPr>
+        <w:t xml:space="preserve">. Effect sizes are from three separate models each containing either </w:t>
+      </w:r>
+      <w:r>
+        <w:rPr>
+          <w:rFonts w:ascii="Times New Roman" w:hAnsi="Times New Roman" w:cs="Times New Roman"/>
+        </w:rPr>
+        <w:t>background nutrients</w:t>
       </w:r>
       <w:r>
         <w:rPr>
@@ -5261,257 +7351,70 @@
         <w:rPr>
           <w:rFonts w:ascii="Times New Roman" w:hAnsi="Times New Roman" w:cs="Times New Roman"/>
         </w:rPr>
-        <w:t>so we</w:t>
-      </w:r>
-      <w:r>
-        <w:rPr>
-          <w:rFonts w:ascii="Times New Roman" w:hAnsi="Times New Roman" w:cs="Times New Roman"/>
-        </w:rPr>
-        <w:t xml:space="preserve"> then constructed three reduced models that each contained only one of the correlated moderators</w:t>
-      </w:r>
-      <w:r>
-        <w:rPr>
-          <w:rFonts w:ascii="Times New Roman" w:hAnsi="Times New Roman" w:cs="Times New Roman"/>
-        </w:rPr>
-        <w:t xml:space="preserve"> and competed them against a null model using AIC</w:t>
-      </w:r>
-      <w:r>
-        <w:rPr>
-          <w:rFonts w:ascii="Times New Roman" w:hAnsi="Times New Roman" w:cs="Times New Roman"/>
-        </w:rPr>
-        <w:t xml:space="preserve">. </w:t>
+        <w:t>absolute latitude</w:t>
+      </w:r>
+      <w:r>
+        <w:rPr>
+          <w:rFonts w:ascii="Times New Roman" w:hAnsi="Times New Roman" w:cs="Times New Roman"/>
+        </w:rPr>
+        <w:t xml:space="preserve">, or temperature. In each model </w:t>
+      </w:r>
+      <w:r>
+        <w:rPr>
+          <w:rFonts w:ascii="Times New Roman" w:hAnsi="Times New Roman" w:cs="Times New Roman"/>
+        </w:rPr>
+        <w:t>primary producer</w:t>
+      </w:r>
+      <w:r>
+        <w:rPr>
+          <w:rFonts w:ascii="Times New Roman" w:hAnsi="Times New Roman" w:cs="Times New Roman"/>
+        </w:rPr>
+        <w:t xml:space="preserve"> group</w:t>
+      </w:r>
+      <w:r>
+        <w:rPr>
+          <w:rFonts w:ascii="Times New Roman" w:hAnsi="Times New Roman" w:cs="Times New Roman"/>
+        </w:rPr>
+        <w:t xml:space="preserve"> and experimental design</w:t>
+      </w:r>
+      <w:r>
+        <w:rPr>
+          <w:rFonts w:ascii="Times New Roman" w:hAnsi="Times New Roman" w:cs="Times New Roman"/>
+        </w:rPr>
+        <w:t xml:space="preserve"> are also included</w:t>
+      </w:r>
+      <w:r>
+        <w:rPr>
+          <w:rFonts w:ascii="Times New Roman" w:hAnsi="Times New Roman" w:cs="Times New Roman"/>
+        </w:rPr>
+        <w:t xml:space="preserve"> as</w:t>
+      </w:r>
+      <w:r>
+        <w:rPr>
+          <w:rFonts w:ascii="Times New Roman" w:hAnsi="Times New Roman" w:cs="Times New Roman"/>
+        </w:rPr>
+        <w:t xml:space="preserve"> categorical</w:t>
+      </w:r>
+      <w:r>
+        <w:rPr>
+          <w:rFonts w:ascii="Times New Roman" w:hAnsi="Times New Roman" w:cs="Times New Roman"/>
+        </w:rPr>
+        <w:t xml:space="preserve"> moderators</w:t>
+      </w:r>
+      <w:r>
+        <w:rPr>
+          <w:rFonts w:ascii="Times New Roman" w:hAnsi="Times New Roman" w:cs="Times New Roman"/>
+        </w:rPr>
+        <w:t>.</w:t>
       </w:r>
     </w:p>
     <w:p>
       <w:pPr>
         <w:spacing w:line="360" w:lineRule="auto"/>
-        <w:ind w:firstLine="720"/>
-        <w:rPr>
-          <w:rFonts w:ascii="Times New Roman" w:hAnsi="Times New Roman" w:cs="Times New Roman"/>
-        </w:rPr>
-      </w:pPr>
-    </w:p>
-    <w:p>
-      <w:pPr>
-        <w:spacing w:line="360" w:lineRule="auto"/>
-        <w:rPr>
-          <w:rFonts w:ascii="Times New Roman" w:hAnsi="Times New Roman" w:cs="Times New Roman"/>
-        </w:rPr>
-      </w:pPr>
-    </w:p>
-    <w:p>
-      <w:pPr>
-        <w:spacing w:line="360" w:lineRule="auto"/>
-        <w:rPr>
-          <w:rFonts w:ascii="Times New Roman" w:hAnsi="Times New Roman" w:cs="Times New Roman"/>
-          <w:i/>
-        </w:rPr>
-      </w:pPr>
-      <w:r>
-        <w:rPr>
-          <w:rFonts w:ascii="Times New Roman" w:hAnsi="Times New Roman" w:cs="Times New Roman"/>
-          <w:i/>
-        </w:rPr>
-        <w:t>Assumption testing</w:t>
-      </w:r>
-    </w:p>
-    <w:p>
-      <w:pPr>
-        <w:spacing w:line="360" w:lineRule="auto"/>
-        <w:rPr>
-          <w:rFonts w:ascii="Times New Roman" w:hAnsi="Times New Roman" w:cs="Times New Roman"/>
-        </w:rPr>
-      </w:pPr>
-      <w:r>
-        <w:rPr>
-          <w:rFonts w:ascii="Times New Roman" w:hAnsi="Times New Roman" w:cs="Times New Roman"/>
-        </w:rPr>
-        <w:tab/>
-      </w:r>
-      <w:r>
-        <w:rPr>
-          <w:rFonts w:ascii="Times New Roman" w:hAnsi="Times New Roman" w:cs="Times New Roman"/>
-        </w:rPr>
-        <w:t>Meta-analyses can be vulnerable to p-value biases in publishing, so we</w:t>
-      </w:r>
-      <w:r>
-        <w:rPr>
-          <w:rFonts w:ascii="Times New Roman" w:hAnsi="Times New Roman" w:cs="Times New Roman"/>
-        </w:rPr>
-        <w:t xml:space="preserve"> calculated </w:t>
-      </w:r>
-      <w:r>
-        <w:rPr>
-          <w:rFonts w:ascii="Times New Roman" w:hAnsi="Times New Roman" w:cs="Times New Roman"/>
-        </w:rPr>
-        <w:t>Rosenthal</w:t>
-      </w:r>
-      <w:r>
-        <w:rPr>
-          <w:rFonts w:ascii="Times New Roman" w:hAnsi="Times New Roman" w:cs="Times New Roman"/>
-        </w:rPr>
-        <w:t>’s failsafe</w:t>
-      </w:r>
-      <w:r>
-        <w:rPr>
-          <w:rFonts w:ascii="Times New Roman" w:hAnsi="Times New Roman" w:cs="Times New Roman"/>
-        </w:rPr>
-        <w:t xml:space="preserve"> number </w:t>
-      </w:r>
-      <w:r>
-        <w:rPr>
-          <w:rFonts w:ascii="Times New Roman" w:hAnsi="Times New Roman" w:cs="Times New Roman"/>
-        </w:rPr>
-        <w:t xml:space="preserve">(the number of non-significant studies we would have to include to overturn our results) </w:t>
-      </w:r>
-      <w:r>
-        <w:rPr>
-          <w:rFonts w:ascii="Times New Roman" w:hAnsi="Times New Roman" w:cs="Times New Roman"/>
-        </w:rPr>
-        <w:t xml:space="preserve">as </w:t>
-      </w:r>
-      <w:r>
-        <w:rPr>
-          <w:rFonts w:ascii="Times New Roman" w:hAnsi="Times New Roman" w:cs="Times New Roman"/>
-        </w:rPr>
-        <w:t>13962</w:t>
-      </w:r>
-      <w:r>
-        <w:rPr>
-          <w:rFonts w:ascii="Times New Roman" w:hAnsi="Times New Roman" w:cs="Times New Roman"/>
-        </w:rPr>
-        <w:t xml:space="preserve">. As some reports contributed multiple observations, we looked for a substantial effect of papers that contributed 10% or greater than the total number of observations (n = 3). We reran each model without each of these potentially influential studies and found no major differences in effect sizes or p-values when each of these studies were excluded. </w:t>
-      </w:r>
-      <w:r>
-        <w:rPr>
-          <w:rFonts w:ascii="Times New Roman" w:hAnsi="Times New Roman" w:cs="Times New Roman"/>
-        </w:rPr>
-        <w:t xml:space="preserve">***Funnel </w:t>
-      </w:r>
-      <w:proofErr w:type="gramStart"/>
-      <w:r>
-        <w:rPr>
-          <w:rFonts w:ascii="Times New Roman" w:hAnsi="Times New Roman" w:cs="Times New Roman"/>
-        </w:rPr>
-        <w:t>plots!*</w:t>
-      </w:r>
-      <w:proofErr w:type="gramEnd"/>
-      <w:r>
-        <w:rPr>
-          <w:rFonts w:ascii="Times New Roman" w:hAnsi="Times New Roman" w:cs="Times New Roman"/>
-        </w:rPr>
-        <w:t>**</w:t>
-      </w:r>
-      <w:bookmarkStart w:id="10" w:name="_GoBack"/>
-      <w:bookmarkEnd w:id="10"/>
-    </w:p>
-    <w:p>
-      <w:pPr>
-        <w:spacing w:line="360" w:lineRule="auto"/>
-        <w:rPr>
-          <w:rFonts w:ascii="Times New Roman" w:hAnsi="Times New Roman" w:cs="Times New Roman"/>
-        </w:rPr>
-      </w:pPr>
-    </w:p>
-    <w:p>
-      <w:pPr>
-        <w:spacing w:line="360" w:lineRule="auto"/>
-        <w:rPr>
-          <w:rFonts w:ascii="Times New Roman" w:hAnsi="Times New Roman" w:cs="Times New Roman"/>
-        </w:rPr>
-      </w:pPr>
-    </w:p>
-    <w:p>
-      <w:pPr>
-        <w:spacing w:line="360" w:lineRule="auto"/>
-        <w:rPr>
-          <w:rFonts w:ascii="Times New Roman" w:hAnsi="Times New Roman" w:cs="Times New Roman"/>
-        </w:rPr>
-      </w:pPr>
-    </w:p>
-    <w:p>
-      <w:pPr>
-        <w:spacing w:line="360" w:lineRule="auto"/>
-        <w:rPr>
-          <w:rFonts w:ascii="Times New Roman" w:hAnsi="Times New Roman" w:cs="Times New Roman"/>
-          <w:u w:val="single"/>
-        </w:rPr>
-      </w:pPr>
-      <w:r>
-        <w:rPr>
-          <w:rFonts w:ascii="Times New Roman" w:hAnsi="Times New Roman" w:cs="Times New Roman"/>
-          <w:u w:val="single"/>
-        </w:rPr>
-        <w:t>Results</w:t>
-      </w:r>
-    </w:p>
-    <w:p>
-      <w:pPr>
-        <w:spacing w:line="360" w:lineRule="auto"/>
-        <w:rPr>
-          <w:rFonts w:ascii="Times New Roman" w:hAnsi="Times New Roman" w:cs="Times New Roman"/>
-        </w:rPr>
-      </w:pPr>
-      <w:r>
-        <w:rPr>
-          <w:rFonts w:ascii="Times New Roman" w:hAnsi="Times New Roman" w:cs="Times New Roman"/>
-        </w:rPr>
-        <w:t>*Describe representation of studies across levels of each mod</w:t>
-      </w:r>
-      <w:r>
-        <w:rPr>
-          <w:rFonts w:ascii="Times New Roman" w:hAnsi="Times New Roman" w:cs="Times New Roman"/>
-        </w:rPr>
-        <w:t>*</w:t>
-      </w:r>
-      <w:r>
-        <w:rPr>
-          <w:rFonts w:ascii="Times New Roman" w:hAnsi="Times New Roman" w:cs="Times New Roman"/>
-        </w:rPr>
-        <w:t xml:space="preserve"> The majority of studies considered </w:t>
-      </w:r>
-      <w:r>
-        <w:rPr>
-          <w:rFonts w:ascii="Times New Roman" w:hAnsi="Times New Roman" w:cs="Times New Roman"/>
-        </w:rPr>
-        <w:t xml:space="preserve">phytoplankton as a primary producer (n = 53), but all four categories had sample sizes over n = 25. </w:t>
-      </w:r>
-      <w:proofErr w:type="spellStart"/>
-      <w:r>
-        <w:rPr>
-          <w:rFonts w:ascii="Times New Roman" w:hAnsi="Times New Roman" w:cs="Times New Roman"/>
-        </w:rPr>
-        <w:t>Unstocked</w:t>
-      </w:r>
-      <w:proofErr w:type="spellEnd"/>
-      <w:r>
-        <w:rPr>
-          <w:rFonts w:ascii="Times New Roman" w:hAnsi="Times New Roman" w:cs="Times New Roman"/>
-        </w:rPr>
-        <w:t xml:space="preserve"> field experiments constituted the majority of experimental designs, but all categories were well represented in the sample size, with the exception of field experiments where n = 9. *Talk about latitude, background nutrients, and temp too*</w:t>
-      </w:r>
-    </w:p>
-    <w:p>
-      <w:pPr>
-        <w:spacing w:line="360" w:lineRule="auto"/>
-        <w:rPr>
-          <w:rFonts w:ascii="Times New Roman" w:hAnsi="Times New Roman" w:cs="Times New Roman"/>
-        </w:rPr>
-      </w:pPr>
-    </w:p>
-    <w:p>
-      <w:pPr>
-        <w:spacing w:line="360" w:lineRule="auto"/>
-        <w:rPr>
-          <w:rFonts w:ascii="Times New Roman" w:hAnsi="Times New Roman" w:cs="Times New Roman"/>
-        </w:rPr>
-      </w:pPr>
-      <w:r>
-        <w:rPr>
-          <w:rFonts w:ascii="Times New Roman" w:hAnsi="Times New Roman" w:cs="Times New Roman"/>
-        </w:rPr>
-        <w:t xml:space="preserve">Nutrient provisioning by animals had a significant and positive effect on primary productivity (XXX). </w:t>
-      </w:r>
+        <w:rPr>
+          <w:rFonts w:ascii="Times New Roman" w:hAnsi="Times New Roman" w:cs="Times New Roman"/>
+        </w:rPr>
+      </w:pPr>
     </w:p>
     <w:p>
       <w:pPr>
@@ -5579,7 +7482,6 @@
         <w:rPr>
           <w:rFonts w:ascii="Times New Roman" w:hAnsi="Times New Roman" w:cs="Times New Roman"/>
         </w:rPr>
-        <w:lastRenderedPageBreak/>
         <w:t xml:space="preserve">Test for residual heterogeneity = are there likely other things introducing variance besides my mods? </w:t>
       </w:r>
       <w:r>
@@ -5652,6 +7554,28 @@
         <w:rPr>
           <w:rFonts w:ascii="Times New Roman" w:hAnsi="Times New Roman" w:cs="Times New Roman"/>
         </w:rPr>
+        <w:t xml:space="preserve">Interesting that we saw a larger effect of pee on algae, when there weren’t any experiments on algae in the tropics??? </w:t>
+      </w:r>
+    </w:p>
+    <w:p>
+      <w:pPr>
+        <w:spacing w:line="360" w:lineRule="auto"/>
+        <w:rPr>
+          <w:rFonts w:ascii="Times New Roman" w:hAnsi="Times New Roman" w:cs="Times New Roman"/>
+        </w:rPr>
+      </w:pPr>
+    </w:p>
+    <w:p>
+      <w:pPr>
+        <w:spacing w:line="360" w:lineRule="auto"/>
+        <w:rPr>
+          <w:rFonts w:ascii="Times New Roman" w:hAnsi="Times New Roman" w:cs="Times New Roman"/>
+        </w:rPr>
+      </w:pPr>
+      <w:r>
+        <w:rPr>
+          <w:rFonts w:ascii="Times New Roman" w:hAnsi="Times New Roman" w:cs="Times New Roman"/>
+        </w:rPr>
         <w:t>FITURE TO DO’s:</w:t>
       </w:r>
     </w:p>
@@ -5690,164 +7614,6 @@
     </w:p>
     <w:p>
       <w:pPr>
-        <w:pStyle w:val="ListParagraph"/>
-        <w:numPr>
-          <w:ilvl w:val="0"/>
-          <w:numId w:val="3"/>
-        </w:numPr>
-        <w:spacing w:line="360" w:lineRule="auto"/>
-        <w:rPr>
-          <w:rFonts w:ascii="Times New Roman" w:hAnsi="Times New Roman" w:cs="Times New Roman"/>
-        </w:rPr>
-      </w:pPr>
-      <w:r>
-        <w:rPr>
-          <w:rFonts w:ascii="Times New Roman" w:hAnsi="Times New Roman" w:cs="Times New Roman"/>
-        </w:rPr>
-        <w:t>Should I further separate Algae into crustose, turf, and fleshy?</w:t>
-      </w:r>
-    </w:p>
-    <w:p>
-      <w:pPr>
-        <w:pStyle w:val="ListParagraph"/>
-        <w:numPr>
-          <w:ilvl w:val="0"/>
-          <w:numId w:val="3"/>
-        </w:numPr>
-        <w:spacing w:line="360" w:lineRule="auto"/>
-        <w:rPr>
-          <w:rFonts w:ascii="Times New Roman" w:hAnsi="Times New Roman" w:cs="Times New Roman"/>
-        </w:rPr>
-      </w:pPr>
-      <w:r>
-        <w:rPr>
-          <w:rFonts w:ascii="Times New Roman" w:hAnsi="Times New Roman" w:cs="Times New Roman"/>
-        </w:rPr>
-        <w:t>Should I run each mod in a separate model?</w:t>
-      </w:r>
-    </w:p>
-    <w:p>
-      <w:pPr>
-        <w:pStyle w:val="ListParagraph"/>
-        <w:numPr>
-          <w:ilvl w:val="1"/>
-          <w:numId w:val="3"/>
-        </w:numPr>
-        <w:spacing w:line="360" w:lineRule="auto"/>
-        <w:rPr>
-          <w:rFonts w:ascii="Times New Roman" w:hAnsi="Times New Roman" w:cs="Times New Roman"/>
-        </w:rPr>
-      </w:pPr>
-      <w:r>
-        <w:rPr>
-          <w:rFonts w:ascii="Times New Roman" w:hAnsi="Times New Roman" w:cs="Times New Roman"/>
-        </w:rPr>
-        <w:t>To generate the coefficient plots and estimates?</w:t>
-      </w:r>
-    </w:p>
-    <w:p>
-      <w:pPr>
-        <w:pStyle w:val="ListParagraph"/>
-        <w:numPr>
-          <w:ilvl w:val="1"/>
-          <w:numId w:val="3"/>
-        </w:numPr>
-        <w:spacing w:line="360" w:lineRule="auto"/>
-        <w:rPr>
-          <w:rFonts w:ascii="Times New Roman" w:hAnsi="Times New Roman" w:cs="Times New Roman"/>
-        </w:rPr>
-      </w:pPr>
-      <w:r>
-        <w:rPr>
-          <w:rFonts w:ascii="Times New Roman" w:hAnsi="Times New Roman" w:cs="Times New Roman"/>
-        </w:rPr>
-        <w:t xml:space="preserve">Should I use the mod argument to ignore intercepts for </w:t>
-      </w:r>
-      <w:r>
-        <w:rPr>
-          <w:rFonts w:ascii="Times New Roman" w:hAnsi="Times New Roman" w:cs="Times New Roman"/>
-        </w:rPr>
-        <w:t>these</w:t>
-      </w:r>
-      <w:r>
-        <w:rPr>
-          <w:rFonts w:ascii="Times New Roman" w:hAnsi="Times New Roman" w:cs="Times New Roman"/>
-        </w:rPr>
-        <w:t xml:space="preserve"> models</w:t>
-      </w:r>
-      <w:r>
-        <w:rPr>
-          <w:rFonts w:ascii="Times New Roman" w:hAnsi="Times New Roman" w:cs="Times New Roman"/>
-        </w:rPr>
-        <w:t>?</w:t>
-      </w:r>
-    </w:p>
-    <w:p>
-      <w:pPr>
-        <w:pStyle w:val="ListParagraph"/>
-        <w:numPr>
-          <w:ilvl w:val="2"/>
-          <w:numId w:val="3"/>
-        </w:numPr>
-        <w:spacing w:line="360" w:lineRule="auto"/>
-        <w:rPr>
-          <w:rFonts w:ascii="Times New Roman" w:hAnsi="Times New Roman" w:cs="Times New Roman"/>
-        </w:rPr>
-      </w:pPr>
-      <w:r>
-        <w:rPr>
-          <w:rFonts w:ascii="Times New Roman" w:hAnsi="Times New Roman" w:cs="Times New Roman"/>
-        </w:rPr>
-        <w:t xml:space="preserve">mods = </w:t>
-      </w:r>
-      <w:proofErr w:type="spellStart"/>
-      <w:r>
-        <w:rPr>
-          <w:rFonts w:ascii="Times New Roman" w:hAnsi="Times New Roman" w:cs="Times New Roman"/>
-        </w:rPr>
-        <w:t>p_group</w:t>
-      </w:r>
-      <w:proofErr w:type="spellEnd"/>
-      <w:r>
-        <w:rPr>
-          <w:rFonts w:ascii="Times New Roman" w:hAnsi="Times New Roman" w:cs="Times New Roman"/>
-        </w:rPr>
-        <w:t xml:space="preserve"> </w:t>
-      </w:r>
-      <w:r>
-        <w:rPr>
-          <w:rFonts w:ascii="Times New Roman" w:hAnsi="Times New Roman" w:cs="Times New Roman"/>
-        </w:rPr>
-        <w:t>–</w:t>
-      </w:r>
-      <w:r>
-        <w:rPr>
-          <w:rFonts w:ascii="Times New Roman" w:hAnsi="Times New Roman" w:cs="Times New Roman"/>
-        </w:rPr>
-        <w:t xml:space="preserve"> 1</w:t>
-      </w:r>
-    </w:p>
-    <w:p>
-      <w:pPr>
-        <w:pStyle w:val="ListParagraph"/>
-        <w:numPr>
-          <w:ilvl w:val="2"/>
-          <w:numId w:val="3"/>
-        </w:numPr>
-        <w:spacing w:line="360" w:lineRule="auto"/>
-        <w:rPr>
-          <w:rFonts w:ascii="Times New Roman" w:hAnsi="Times New Roman" w:cs="Times New Roman"/>
-        </w:rPr>
-      </w:pPr>
-      <w:r>
-        <w:rPr>
-          <w:rFonts w:ascii="Times New Roman" w:hAnsi="Times New Roman" w:cs="Times New Roman"/>
-        </w:rPr>
-        <w:t>When I do this, the coefficients and p-values aren’t significantly different than when I run the model with background nutrients</w:t>
-      </w:r>
-    </w:p>
-    <w:p>
-      <w:pPr>
         <w:spacing w:line="360" w:lineRule="auto"/>
         <w:ind w:firstLine="720"/>
         <w:rPr>
@@ -6196,7 +7962,6 @@
           <w:rFonts w:ascii="Times New Roman" w:hAnsi="Times New Roman" w:cs="Times New Roman"/>
           <w:lang w:val="en-CA"/>
         </w:rPr>
-        <w:lastRenderedPageBreak/>
         <w:t>-</w:t>
       </w:r>
       <w:r>
@@ -6493,7 +8258,7 @@
                     <pic:cNvPicPr/>
                   </pic:nvPicPr>
                   <pic:blipFill rotWithShape="1">
-                    <a:blip r:embed="rId10">
+                    <a:blip r:embed="rId13">
                       <a:extLst>
                         <a:ext uri="{28A0092B-C50C-407E-A947-70E740481C1C}">
                           <a14:useLocalDpi xmlns:a14="http://schemas.microsoft.com/office/drawing/2010/main" val="0"/>
@@ -6568,54 +8333,164 @@
         <w:rPr>
           <w:rFonts w:ascii="Calibri" w:cs="Calibri"/>
         </w:rPr>
+        <w:t xml:space="preserve"> </w:t>
+      </w:r>
+      <w:r>
+        <w:rPr>
+          <w:rFonts w:ascii="Calibri" w:cs="Calibri"/>
+        </w:rPr>
+        <w:fldChar w:fldCharType="begin"/>
+      </w:r>
+      <w:r>
+        <w:rPr>
+          <w:rFonts w:ascii="Calibri" w:cs="Calibri"/>
+        </w:rPr>
+        <w:instrText xml:space="preserve"> ADDIN ZOTERO_BIBL {"uncited":[],"omitted":[],"custom":[]} CSL_BIBLIOGRAPHY </w:instrText>
+      </w:r>
+      <w:r>
+        <w:rPr>
+          <w:rFonts w:ascii="Calibri" w:cs="Calibri"/>
+        </w:rPr>
+        <w:fldChar w:fldCharType="separate"/>
+      </w:r>
+      <w:r>
+        <w:rPr>
+          <w:rFonts w:ascii="Calibri" w:cs="Calibri"/>
+        </w:rPr>
+        <w:t>Allgeier, J.E., Burkepile, D.E., Layman, C.A., 2017. Animal pee in the sea: consumer-mediated nutrient dynamics in the world’s changing oceans. Global Change Biology 23, 2166–2178. https://doi.org/10.1111/gcb.13625</w:t>
+      </w:r>
+    </w:p>
+    <w:p>
+      <w:pPr>
+        <w:pStyle w:val="Bibliography"/>
+        <w:rPr>
+          <w:rFonts w:ascii="Calibri" w:cs="Calibri"/>
+        </w:rPr>
+      </w:pPr>
+      <w:r>
+        <w:rPr>
+          <w:rFonts w:ascii="Calibri" w:cs="Calibri"/>
+        </w:rPr>
+        <w:t>Allgeier, J.E., Rosemond, A.D., Layman, C.A., 2011. The frequency and magnitude of non-additive responses to multiple nutrient enrichment. Journal of Applied Ecology 48, 96–101. https://doi.org/10.1111/j.1365-2664.2010.01894.x</w:t>
+      </w:r>
+    </w:p>
+    <w:p>
+      <w:pPr>
+        <w:pStyle w:val="Bibliography"/>
+        <w:rPr>
+          <w:rFonts w:ascii="Calibri" w:cs="Calibri"/>
+        </w:rPr>
+      </w:pPr>
+      <w:r>
+        <w:rPr>
+          <w:rFonts w:ascii="Calibri" w:cs="Calibri"/>
+        </w:rPr>
+        <w:t>Atkinson, C.L., Capps, K.A., Rugenski, A.T., Vanni, M.J., 2017. Consumer-driven nutrient dynamics in freshwater ecosystems: from individuals to ecosystems. Biological Reviews 92, 2003–2023. https://doi.org/10.1111/brv.12318</w:t>
+      </w:r>
+    </w:p>
+    <w:p>
+      <w:pPr>
+        <w:pStyle w:val="Bibliography"/>
+        <w:rPr>
+          <w:rFonts w:ascii="Calibri" w:cs="Calibri"/>
+        </w:rPr>
+      </w:pPr>
+      <w:r>
+        <w:rPr>
+          <w:rFonts w:ascii="Calibri" w:cs="Calibri"/>
+        </w:rPr>
+        <w:t>Bracken, M.E.S., 2004. Invertebrate-Mediated Nutrient Loading Increases Growth of an Intertidal Macroalga1. Journal of Phycology 40, 1032–1041. https://doi.org/10.1111/j.1529-8817.2004.03106.x</w:t>
+      </w:r>
+    </w:p>
+    <w:p>
+      <w:pPr>
+        <w:pStyle w:val="Bibliography"/>
+        <w:rPr>
+          <w:rFonts w:ascii="Calibri" w:cs="Calibri"/>
+        </w:rPr>
+      </w:pPr>
+      <w:r>
+        <w:rPr>
+          <w:rFonts w:ascii="Calibri" w:cs="Calibri"/>
+        </w:rPr>
+        <w:t>Bracken, M.E.S., Gonzalez-Dorantes, C.A., Stachowicz, J.J., 2007. Whole-community mutualism: Associated invertebrates facilitate a dominant habitat-forming seaweed. Ecology 88, 2211–2219. https://doi.org/10.1890/06-0881.1</w:t>
+      </w:r>
+    </w:p>
+    <w:p>
+      <w:pPr>
+        <w:pStyle w:val="Bibliography"/>
+        <w:rPr>
+          <w:rFonts w:ascii="Calibri" w:cs="Calibri"/>
+        </w:rPr>
+      </w:pPr>
+      <w:r>
+        <w:rPr>
+          <w:rFonts w:ascii="Calibri" w:cs="Calibri"/>
+        </w:rPr>
+        <w:t xml:space="preserve">Brzezinksi, M., Reed, D., Harrer, S., Rassweiler, A., Melack, J., Goodridge, B., Dugan, J., 2013. Multiple sources and forms of nitrogen sustain year-round kelp growth on the inner </w:t>
+      </w:r>
+      <w:r>
+        <w:rPr>
+          <w:rFonts w:ascii="Calibri" w:cs="Calibri"/>
+        </w:rPr>
         <w:lastRenderedPageBreak/>
-        <w:t xml:space="preserve"> </w:t>
-      </w:r>
-      <w:r>
+        <w:t>continental shelf of the Santa Barbara Channel. oceanog 26, 114–123. https://doi.org/10.5670/oceanog.2013.53</w:t>
+      </w:r>
+    </w:p>
+    <w:p>
+      <w:pPr>
+        <w:pStyle w:val="Bibliography"/>
         <w:rPr>
           <w:rFonts w:ascii="Calibri" w:cs="Calibri"/>
         </w:rPr>
-        <w:fldChar w:fldCharType="begin"/>
-      </w:r>
+      </w:pPr>
       <w:r>
         <w:rPr>
           <w:rFonts w:ascii="Calibri" w:cs="Calibri"/>
         </w:rPr>
-        <w:instrText xml:space="preserve"> ADDIN ZOTERO_BIBL {"uncited":[],"omitted":[],"custom":[]} CSL_BIBLIOGRAPHY </w:instrText>
-      </w:r>
-      <w:r>
+        <w:t>Burkepile, D.E., Hay, M.E., 2006. Herbivore Vs. Nutrient Control of Marine Primary Producers: Context-Dependent Effects. Ecology 87, 3128–3139. https://doi.org/10.1890/0012-9658(2006)87[3128:HVNCOM]2.0.CO;2</w:t>
+      </w:r>
+    </w:p>
+    <w:p>
+      <w:pPr>
+        <w:pStyle w:val="Bibliography"/>
         <w:rPr>
           <w:rFonts w:ascii="Calibri" w:cs="Calibri"/>
         </w:rPr>
-        <w:fldChar w:fldCharType="separate"/>
-      </w:r>
-      <w:proofErr w:type="spellStart"/>
+      </w:pPr>
       <w:r>
         <w:rPr>
           <w:rFonts w:ascii="Calibri" w:cs="Calibri"/>
         </w:rPr>
-        <w:t>Allgeier</w:t>
-      </w:r>
-      <w:proofErr w:type="spellEnd"/>
-      <w:r>
+        <w:t>Elser, J.J., Bracken, M.E.S., Cleland, E.E., Gruner, D.S., Harpole, W.S., Hillebrand, H., Ngai, J.T., Seabloom, E.W., Shurin, J.B., Smith, J.E., 2007. Global analysis of nitrogen and phosphorus limitation of primary producers in freshwater, marine and terrestrial ecosystems. Ecology Letters 10, 1135–1142. https://doi.org/10.1111/j.1461-0248.2007.01113.x</w:t>
+      </w:r>
+    </w:p>
+    <w:p>
+      <w:pPr>
+        <w:pStyle w:val="Bibliography"/>
         <w:rPr>
           <w:rFonts w:ascii="Calibri" w:cs="Calibri"/>
         </w:rPr>
-        <w:t xml:space="preserve">, J.E., </w:t>
-      </w:r>
-      <w:proofErr w:type="spellStart"/>
+      </w:pPr>
       <w:r>
         <w:rPr>
           <w:rFonts w:ascii="Calibri" w:cs="Calibri"/>
         </w:rPr>
-        <w:t>Burkepile</w:t>
-      </w:r>
-      <w:proofErr w:type="spellEnd"/>
-      <w:r>
+        <w:t>Elser, J.J., Urabe, J., 1999. The Stoichiometry of Consumer-Driven Nutrient Recycling: Theory, Observations, and Consequences. Ecology 80, 735–751. https://doi.org/10.1890/0012-9658(1999)080[0735:TSOCDN]2.0.CO;2</w:t>
+      </w:r>
+    </w:p>
+    <w:p>
+      <w:pPr>
+        <w:pStyle w:val="Bibliography"/>
         <w:rPr>
           <w:rFonts w:ascii="Calibri" w:cs="Calibri"/>
         </w:rPr>
-        <w:t>, D.E., Layman, C.A., 2017. Animal pee in the sea: consumer-mediated nutrient dynamics in the world’s changing oceans. Global Change Biology 23, 2166–2178. https://doi.org/10.1111/gcb.13625</w:t>
+      </w:pPr>
+      <w:r>
+        <w:rPr>
+          <w:rFonts w:ascii="Calibri" w:cs="Calibri"/>
+        </w:rPr>
+        <w:t>Gruner, D.S., Smith, J.E., Seabloom, E.W., Sandin, S.A., Ngai, J.T., Hillebrand, H., Harpole, W.S., Elser, J.J., Cleland, E.E., Bracken, M.E.S., Borer, E.T., Bolker, B.M., 2008. A cross-system synthesis of consumer and nutrient resource control on producer biomass. Ecology Letters 11, 740–755. https://doi.org/10.1111/j.1461-0248.2008.01192.x</w:t>
       </w:r>
     </w:p>
     <w:p>
@@ -6625,19 +8500,25 @@
           <w:rFonts w:ascii="Calibri" w:cs="Calibri"/>
         </w:rPr>
       </w:pPr>
-      <w:proofErr w:type="spellStart"/>
       <w:r>
         <w:rPr>
           <w:rFonts w:ascii="Calibri" w:cs="Calibri"/>
         </w:rPr>
-        <w:t>Allgeier</w:t>
-      </w:r>
-      <w:proofErr w:type="spellEnd"/>
-      <w:r>
+        <w:t>Hillman, K., Walker, D.I., Larkum, A.W.D., McComb, A.J., 1989. Productivity and nutrient limitation, in: Larkum, A.W.D., McComb, A.J., Shephard, S.A. (Eds.), Biology of Seagrasses : A Treatise on the Biology of Seagrasses with Special Reference to the Australian Region. Elsevier Science Pub., Amsterdam, The Netherlands, pp. 635–685.</w:t>
+      </w:r>
+    </w:p>
+    <w:p>
+      <w:pPr>
+        <w:pStyle w:val="Bibliography"/>
         <w:rPr>
           <w:rFonts w:ascii="Calibri" w:cs="Calibri"/>
         </w:rPr>
-        <w:t>, J.E., Rosemond, A.D., Layman, C.A., 2011. The frequency and magnitude of non-additive responses to multiple nutrient enrichment. Journal of Applied Ecology 48, 96–101. https://doi.org/10.1111/j.1365-2664.2010.01894.x</w:t>
+      </w:pPr>
+      <w:r>
+        <w:rPr>
+          <w:rFonts w:ascii="Calibri" w:cs="Calibri"/>
+        </w:rPr>
+        <w:t>Jackson, G.A., 1977. Nutrients and Production of Giant Kelp, Macrocystis pyrifera, Off Southern California. Limnology and Oceanography 22, 979–995.</w:t>
       </w:r>
     </w:p>
     <w:p>
@@ -6651,35 +8532,35 @@
         <w:rPr>
           <w:rFonts w:ascii="Calibri" w:cs="Calibri"/>
         </w:rPr>
-        <w:t xml:space="preserve">Atkinson, C.L., Capps, K.A., </w:t>
-      </w:r>
-      <w:proofErr w:type="spellStart"/>
-      <w:r>
+        <w:t>McNaughton, S.J., Ruess, R.W., Seagle, S.W., 1988. Large mammals and process dynamics in African ecosystems. BioScience 38, 794–800. https://doi.org/10.2307/1310789</w:t>
+      </w:r>
+    </w:p>
+    <w:p>
+      <w:pPr>
+        <w:pStyle w:val="Bibliography"/>
         <w:rPr>
           <w:rFonts w:ascii="Calibri" w:cs="Calibri"/>
         </w:rPr>
-        <w:t>Rugenski</w:t>
-      </w:r>
-      <w:proofErr w:type="spellEnd"/>
+      </w:pPr>
       <w:r>
         <w:rPr>
           <w:rFonts w:ascii="Calibri" w:cs="Calibri"/>
         </w:rPr>
-        <w:t xml:space="preserve">, A.T., </w:t>
-      </w:r>
-      <w:proofErr w:type="spellStart"/>
-      <w:r>
+        <w:t>McPhee-Shaw, E.E., Siegel, D.A., Washburn, L., Brzezinski, M.A., Jones, J.L., Leydecker, A., Melack, J., 2007. Mechanisms for nutrient delivery to the inner shelf: Observations from the Santa Barbara Channel. Limnology and Oceanography 52, 1748–1766. https://doi.org/10.4319/lo.2007.52.5.1748</w:t>
+      </w:r>
+    </w:p>
+    <w:p>
+      <w:pPr>
+        <w:pStyle w:val="Bibliography"/>
         <w:rPr>
           <w:rFonts w:ascii="Calibri" w:cs="Calibri"/>
         </w:rPr>
-        <w:t>Vanni</w:t>
-      </w:r>
-      <w:proofErr w:type="spellEnd"/>
+      </w:pPr>
       <w:r>
         <w:rPr>
           <w:rFonts w:ascii="Calibri" w:cs="Calibri"/>
         </w:rPr>
-        <w:t>, M.J., 2017. Consumer-driven nutrient dynamics in freshwater ecosystems: from individuals to ecosystems. Biological Reviews 92, 2003–2023. https://doi.org/10.1111/brv.12318</w:t>
+        <w:t>Meyer, J.L., Schultz, E.T., Helfman, G.S., 1983. Fish schools: An asset to corals. Science 220, 1047–1049. https://doi.org/10.1126/science.220.4601.1047</w:t>
       </w:r>
     </w:p>
     <w:p>
@@ -6693,7 +8574,7 @@
         <w:rPr>
           <w:rFonts w:ascii="Calibri" w:cs="Calibri"/>
         </w:rPr>
-        <w:t>Bracken, M.E.S., 2004. Invertebrate-Mediated Nutrient Loading Increases Growth of an Intertidal Macroalga1. Journal of Phycology 40, 1032–1041. https://doi.org/10.1111/j.1529-8817.2004.03106.x</w:t>
+        <w:t>Moore, C.M., Mills, M.M., Arrigo, K.R., Berman-Frank, I., Bopp, L., Boyd, P.W., Galbraith, E.D., Geider, R.J., Guieu, C., Jaccard, S.L., Jickells, T.D., La Roche, J., Lenton, T.M., Mahowald, N.M., Marañón, E., Marinov, I., Moore, J.K., Nakatsuka, T., Oschlies, A., Saito, M.A., Thingstad, T.F., Tsuda, A., Ulloa, O., 2013. Processes and patterns of oceanic nutrient limitation. Nature Geoscience 6, 701–710. https://doi.org/10.1038/ngeo1765</w:t>
       </w:r>
     </w:p>
     <w:p>
@@ -6707,35 +8588,36 @@
         <w:rPr>
           <w:rFonts w:ascii="Calibri" w:cs="Calibri"/>
         </w:rPr>
-        <w:t>Bracken, M.E.S., Gonzalez-</w:t>
-      </w:r>
-      <w:proofErr w:type="spellStart"/>
-      <w:r>
+        <w:t>Peterson, B., Heck, K., 2001. Positive interactions between suspension-feeding bivalves and seagrass-a facultative mutualism. Mar. Ecol. Prog. Ser. 213, 143–155. https://doi.org/10.3354/meps213143</w:t>
+      </w:r>
+    </w:p>
+    <w:p>
+      <w:pPr>
+        <w:pStyle w:val="Bibliography"/>
         <w:rPr>
           <w:rFonts w:ascii="Calibri" w:cs="Calibri"/>
         </w:rPr>
-        <w:t>Dorantes</w:t>
-      </w:r>
-      <w:proofErr w:type="spellEnd"/>
+      </w:pPr>
       <w:r>
         <w:rPr>
           <w:rFonts w:ascii="Calibri" w:cs="Calibri"/>
         </w:rPr>
-        <w:t xml:space="preserve">, C.A., </w:t>
-      </w:r>
-      <w:proofErr w:type="spellStart"/>
-      <w:r>
+        <w:t>Pfister, C.A., Altabet, M.A., Post, D., 2014. Animal regeneration and microbial retention of nitrogen along coastal rocky shores. Ecology 95, 2803–2814. https://doi.org/10.1890/13-1825.1</w:t>
+      </w:r>
+    </w:p>
+    <w:p>
+      <w:pPr>
+        <w:pStyle w:val="Bibliography"/>
         <w:rPr>
           <w:rFonts w:ascii="Calibri" w:cs="Calibri"/>
         </w:rPr>
-        <w:t>Stachowicz</w:t>
-      </w:r>
-      <w:proofErr w:type="spellEnd"/>
+      </w:pPr>
       <w:r>
         <w:rPr>
           <w:rFonts w:ascii="Calibri" w:cs="Calibri"/>
         </w:rPr>
-        <w:t>, J.J., 2007. Whole-community mutualism: Associated invertebrates facilitate a dominant habitat-forming seaweed. Ecology 88, 2211–2219. https://doi.org/10.1890/06-0881.1</w:t>
+        <w:lastRenderedPageBreak/>
+        <w:t>Phillips, J.C., Hurd, C.L., 2004. Kinetics of nitrate, ammonium, and urea uptake by four intertidal seaweeds from New Zealand. Journal of Phycology 40, 534–545. https://doi.org/10.1111/j.1529-8817.2004.03157.x</w:t>
       </w:r>
     </w:p>
     <w:p>
@@ -6745,950 +8627,95 @@
           <w:rFonts w:ascii="Calibri" w:cs="Calibri"/>
         </w:rPr>
       </w:pPr>
-      <w:proofErr w:type="spellStart"/>
       <w:r>
         <w:rPr>
           <w:rFonts w:ascii="Calibri" w:cs="Calibri"/>
         </w:rPr>
-        <w:t>Brzezinksi</w:t>
-      </w:r>
-      <w:proofErr w:type="spellEnd"/>
-      <w:r>
+        <w:t>Probyn, T.A., McQuaid, C.D., 1985. In-situ measurements of nitrogenous nutrient uptake by kelp (Ecklonia maxima) and phytoplankton in a nitrate-rich upwelling environment. Mar. Biol. 88, 149–154. https://doi.org/10.1007/BF00397162</w:t>
+      </w:r>
+    </w:p>
+    <w:p>
+      <w:pPr>
+        <w:pStyle w:val="Bibliography"/>
         <w:rPr>
           <w:rFonts w:ascii="Calibri" w:cs="Calibri"/>
         </w:rPr>
-        <w:t xml:space="preserve">, M., Reed, D., </w:t>
-      </w:r>
-      <w:proofErr w:type="spellStart"/>
+      </w:pPr>
       <w:r>
         <w:rPr>
           <w:rFonts w:ascii="Calibri" w:cs="Calibri"/>
         </w:rPr>
-        <w:t>Harrer</w:t>
-      </w:r>
-      <w:proofErr w:type="spellEnd"/>
-      <w:r>
+        <w:t>Ryther, J.H., Dunstan, W.M., 1971. Nitrogen, phosphorus, and eutrophication in the coastal marine environment. Science 171, 1008–1013. https://doi.org/10.1126/science.171.3975.1008</w:t>
+      </w:r>
+    </w:p>
+    <w:p>
+      <w:pPr>
+        <w:pStyle w:val="Bibliography"/>
         <w:rPr>
           <w:rFonts w:ascii="Calibri" w:cs="Calibri"/>
         </w:rPr>
-        <w:t xml:space="preserve">, S., </w:t>
-      </w:r>
-      <w:proofErr w:type="spellStart"/>
+      </w:pPr>
       <w:r>
         <w:rPr>
           <w:rFonts w:ascii="Calibri" w:cs="Calibri"/>
         </w:rPr>
-        <w:t>Rassweiler</w:t>
-      </w:r>
-      <w:proofErr w:type="spellEnd"/>
-      <w:r>
+        <w:t>Schindler, D.W., 1974. Eutrophication and Recovery in Experimental Lakes: Implications for Lake Management. Science 184, 897–899. https://doi.org/10.1126/science.184.4139.897</w:t>
+      </w:r>
+    </w:p>
+    <w:p>
+      <w:pPr>
+        <w:pStyle w:val="Bibliography"/>
         <w:rPr>
           <w:rFonts w:ascii="Calibri" w:cs="Calibri"/>
         </w:rPr>
-        <w:t xml:space="preserve">, A., </w:t>
-      </w:r>
-      <w:proofErr w:type="spellStart"/>
+      </w:pPr>
       <w:r>
         <w:rPr>
           <w:rFonts w:ascii="Calibri" w:cs="Calibri"/>
         </w:rPr>
-        <w:t>Melack</w:t>
-      </w:r>
-      <w:proofErr w:type="spellEnd"/>
-      <w:r>
+        <w:t>Sitters, J., Bakker, E.S., Veldhuis, M.P., Veen, G.F., Olde Venterink, H., Vanni, M.J., 2017. The stoichiometry of nutrient release by terrestrial herbivores and its ecosystem consequences. Front. Earth Sci. 5. https://doi.org/10.3389/feart.2017.00032</w:t>
+      </w:r>
+    </w:p>
+    <w:p>
+      <w:pPr>
+        <w:pStyle w:val="Bibliography"/>
         <w:rPr>
           <w:rFonts w:ascii="Calibri" w:cs="Calibri"/>
         </w:rPr>
-        <w:t xml:space="preserve">, J., </w:t>
-      </w:r>
-      <w:proofErr w:type="spellStart"/>
+      </w:pPr>
       <w:r>
         <w:rPr>
           <w:rFonts w:ascii="Calibri" w:cs="Calibri"/>
         </w:rPr>
-        <w:t>Goodridge</w:t>
-      </w:r>
-      <w:proofErr w:type="spellEnd"/>
-      <w:r>
+        <w:t>Smith, V.H., Tilman, G.D., Nekola, J.C., 1999. Eutrophication: impacts of excess nutrient inputs on freshwater, marine, and terrestrial ecosystems. Environmental Pollution 100, 179–196. https://doi.org/10.1016/S0269-7491(99)00091-3</w:t>
+      </w:r>
+    </w:p>
+    <w:p>
+      <w:pPr>
+        <w:pStyle w:val="Bibliography"/>
         <w:rPr>
           <w:rFonts w:ascii="Calibri" w:cs="Calibri"/>
         </w:rPr>
-        <w:t xml:space="preserve">, B., Dugan, J., 2013. Multiple sources and forms of nitrogen sustain year-round kelp growth on the inner continental shelf of the Santa Barbara Channel. </w:t>
-      </w:r>
-      <w:proofErr w:type="spellStart"/>
+      </w:pPr>
       <w:r>
         <w:rPr>
           <w:rFonts w:ascii="Calibri" w:cs="Calibri"/>
         </w:rPr>
-        <w:t>oceanog</w:t>
-      </w:r>
-      <w:proofErr w:type="spellEnd"/>
-      <w:r>
+        <w:t>Vanni, M.J., 2002. Nutrient cycling by animals in freshwater ecosystems. Annual Review of Ecology and Systematics 33, 341–370. https://doi.org/10.1146/annurev.ecolsys.33.010802.150519</w:t>
+      </w:r>
+    </w:p>
+    <w:p>
+      <w:pPr>
+        <w:pStyle w:val="Bibliography"/>
         <w:rPr>
           <w:rFonts w:ascii="Calibri" w:cs="Calibri"/>
         </w:rPr>
-        <w:t xml:space="preserve"> 26, 114–123. https://doi.org/10.5670/oceanog.2013.53</w:t>
-      </w:r>
-    </w:p>
-    <w:p>
-      <w:pPr>
-        <w:pStyle w:val="Bibliography"/>
+      </w:pPr>
+      <w:r>
         <w:rPr>
           <w:rFonts w:ascii="Calibri" w:cs="Calibri"/>
         </w:rPr>
-      </w:pPr>
-      <w:proofErr w:type="spellStart"/>
-      <w:r>
-        <w:rPr>
-          <w:rFonts w:ascii="Calibri" w:cs="Calibri"/>
-        </w:rPr>
-        <w:t>Burkepile</w:t>
-      </w:r>
-      <w:proofErr w:type="spellEnd"/>
-      <w:r>
-        <w:rPr>
-          <w:rFonts w:ascii="Calibri" w:cs="Calibri"/>
-        </w:rPr>
-        <w:t>, D.E., Hay, M.E., 2006. Herbivore Vs. Nutrient Control of Marine Primary Producers: Context-Dependent Effects. Ecology 87, 3128–3139. https://doi.org/10.1890/0012-9658(2006)87[</w:t>
-      </w:r>
-      <w:proofErr w:type="gramStart"/>
-      <w:r>
-        <w:rPr>
-          <w:rFonts w:ascii="Calibri" w:cs="Calibri"/>
-        </w:rPr>
-        <w:t>3128:HVNCOM</w:t>
-      </w:r>
-      <w:proofErr w:type="gramEnd"/>
-      <w:r>
-        <w:rPr>
-          <w:rFonts w:ascii="Calibri" w:cs="Calibri"/>
-        </w:rPr>
-        <w:t>]2.0.CO;2</w:t>
-      </w:r>
-    </w:p>
-    <w:p>
-      <w:pPr>
-        <w:pStyle w:val="Bibliography"/>
-        <w:rPr>
-          <w:rFonts w:ascii="Calibri" w:cs="Calibri"/>
-        </w:rPr>
-      </w:pPr>
-      <w:proofErr w:type="spellStart"/>
-      <w:r>
-        <w:rPr>
-          <w:rFonts w:ascii="Calibri" w:cs="Calibri"/>
-        </w:rPr>
-        <w:t>Elser</w:t>
-      </w:r>
-      <w:proofErr w:type="spellEnd"/>
-      <w:r>
-        <w:rPr>
-          <w:rFonts w:ascii="Calibri" w:cs="Calibri"/>
-        </w:rPr>
-        <w:t xml:space="preserve">, J.J., Bracken, M.E.S., Cleland, E.E., Gruner, D.S., </w:t>
-      </w:r>
-      <w:proofErr w:type="spellStart"/>
-      <w:r>
-        <w:rPr>
-          <w:rFonts w:ascii="Calibri" w:cs="Calibri"/>
-        </w:rPr>
-        <w:t>Harpole</w:t>
-      </w:r>
-      <w:proofErr w:type="spellEnd"/>
-      <w:r>
-        <w:rPr>
-          <w:rFonts w:ascii="Calibri" w:cs="Calibri"/>
-        </w:rPr>
-        <w:t xml:space="preserve">, W.S., Hillebrand, H., Ngai, J.T., </w:t>
-      </w:r>
-      <w:proofErr w:type="spellStart"/>
-      <w:r>
-        <w:rPr>
-          <w:rFonts w:ascii="Calibri" w:cs="Calibri"/>
-        </w:rPr>
-        <w:t>Seabloom</w:t>
-      </w:r>
-      <w:proofErr w:type="spellEnd"/>
-      <w:r>
-        <w:rPr>
-          <w:rFonts w:ascii="Calibri" w:cs="Calibri"/>
-        </w:rPr>
-        <w:t xml:space="preserve">, E.W., </w:t>
-      </w:r>
-      <w:proofErr w:type="spellStart"/>
-      <w:r>
-        <w:rPr>
-          <w:rFonts w:ascii="Calibri" w:cs="Calibri"/>
-        </w:rPr>
-        <w:t>Shurin</w:t>
-      </w:r>
-      <w:proofErr w:type="spellEnd"/>
-      <w:r>
-        <w:rPr>
-          <w:rFonts w:ascii="Calibri" w:cs="Calibri"/>
-        </w:rPr>
-        <w:t>, J.B., Smith, J.E., 2007. Global analysis of nitrogen and phosphorus limitation of primary producers in freshwater, marine and terrestrial ecosystems. Ecology Letters 10, 1135–1142. https://doi.org/10.1111/j.1461-0248.2007.01113.x</w:t>
-      </w:r>
-    </w:p>
-    <w:p>
-      <w:pPr>
-        <w:pStyle w:val="Bibliography"/>
-        <w:rPr>
-          <w:rFonts w:ascii="Calibri" w:cs="Calibri"/>
-        </w:rPr>
-      </w:pPr>
-      <w:proofErr w:type="spellStart"/>
-      <w:r>
-        <w:rPr>
-          <w:rFonts w:ascii="Calibri" w:cs="Calibri"/>
-        </w:rPr>
-        <w:t>Elser</w:t>
-      </w:r>
-      <w:proofErr w:type="spellEnd"/>
-      <w:r>
-        <w:rPr>
-          <w:rFonts w:ascii="Calibri" w:cs="Calibri"/>
-        </w:rPr>
-        <w:t>, J.J., Urabe, J., 1999. The Stoichiometry of Consumer-Driven Nutrient Recycling: Theory, Observations, and Consequences. Ecology 80, 735–751. https://doi.org/10.1890/0012-9658(1999)080[</w:t>
-      </w:r>
-      <w:proofErr w:type="gramStart"/>
-      <w:r>
-        <w:rPr>
-          <w:rFonts w:ascii="Calibri" w:cs="Calibri"/>
-        </w:rPr>
-        <w:t>0735:TSOCDN</w:t>
-      </w:r>
-      <w:proofErr w:type="gramEnd"/>
-      <w:r>
-        <w:rPr>
-          <w:rFonts w:ascii="Calibri" w:cs="Calibri"/>
-        </w:rPr>
-        <w:t>]2.0.CO;2</w:t>
-      </w:r>
-    </w:p>
-    <w:p>
-      <w:pPr>
-        <w:pStyle w:val="Bibliography"/>
-        <w:rPr>
-          <w:rFonts w:ascii="Calibri" w:cs="Calibri"/>
-        </w:rPr>
-      </w:pPr>
-      <w:r>
-        <w:rPr>
-          <w:rFonts w:ascii="Calibri" w:cs="Calibri"/>
-        </w:rPr>
-        <w:t xml:space="preserve">Gruner, D.S., Smith, J.E., </w:t>
-      </w:r>
-      <w:proofErr w:type="spellStart"/>
-      <w:r>
-        <w:rPr>
-          <w:rFonts w:ascii="Calibri" w:cs="Calibri"/>
-        </w:rPr>
-        <w:t>Seabloom</w:t>
-      </w:r>
-      <w:proofErr w:type="spellEnd"/>
-      <w:r>
-        <w:rPr>
-          <w:rFonts w:ascii="Calibri" w:cs="Calibri"/>
-        </w:rPr>
-        <w:t xml:space="preserve">, E.W., </w:t>
-      </w:r>
-      <w:proofErr w:type="spellStart"/>
-      <w:r>
-        <w:rPr>
-          <w:rFonts w:ascii="Calibri" w:cs="Calibri"/>
-        </w:rPr>
-        <w:t>Sandin</w:t>
-      </w:r>
-      <w:proofErr w:type="spellEnd"/>
-      <w:r>
-        <w:rPr>
-          <w:rFonts w:ascii="Calibri" w:cs="Calibri"/>
-        </w:rPr>
-        <w:t xml:space="preserve">, S.A., Ngai, J.T., Hillebrand, H., </w:t>
-      </w:r>
-      <w:proofErr w:type="spellStart"/>
-      <w:r>
-        <w:rPr>
-          <w:rFonts w:ascii="Calibri" w:cs="Calibri"/>
-        </w:rPr>
-        <w:t>Harpole</w:t>
-      </w:r>
-      <w:proofErr w:type="spellEnd"/>
-      <w:r>
-        <w:rPr>
-          <w:rFonts w:ascii="Calibri" w:cs="Calibri"/>
-        </w:rPr>
-        <w:t xml:space="preserve">, W.S., </w:t>
-      </w:r>
-      <w:proofErr w:type="spellStart"/>
-      <w:r>
-        <w:rPr>
-          <w:rFonts w:ascii="Calibri" w:cs="Calibri"/>
-        </w:rPr>
-        <w:t>Elser</w:t>
-      </w:r>
-      <w:proofErr w:type="spellEnd"/>
-      <w:r>
-        <w:rPr>
-          <w:rFonts w:ascii="Calibri" w:cs="Calibri"/>
-        </w:rPr>
-        <w:t xml:space="preserve">, J.J., Cleland, E.E., Bracken, M.E.S., Borer, E.T., </w:t>
-      </w:r>
-      <w:proofErr w:type="spellStart"/>
-      <w:r>
-        <w:rPr>
-          <w:rFonts w:ascii="Calibri" w:cs="Calibri"/>
-        </w:rPr>
-        <w:t>Bolker</w:t>
-      </w:r>
-      <w:proofErr w:type="spellEnd"/>
-      <w:r>
-        <w:rPr>
-          <w:rFonts w:ascii="Calibri" w:cs="Calibri"/>
-        </w:rPr>
-        <w:t>, B.M., 2008. A cross-system synthesis of consumer and nutrient resource control on producer biomass. Ecology Letters 11, 740–755. https://doi.org/10.1111/j.1461-0248.2008.01192.x</w:t>
-      </w:r>
-    </w:p>
-    <w:p>
-      <w:pPr>
-        <w:pStyle w:val="Bibliography"/>
-        <w:rPr>
-          <w:rFonts w:ascii="Calibri" w:cs="Calibri"/>
-        </w:rPr>
-      </w:pPr>
-      <w:r>
-        <w:rPr>
-          <w:rFonts w:ascii="Calibri" w:cs="Calibri"/>
-        </w:rPr>
-        <w:t xml:space="preserve">Hillman, K., Walker, D.I., </w:t>
-      </w:r>
-      <w:proofErr w:type="spellStart"/>
-      <w:r>
-        <w:rPr>
-          <w:rFonts w:ascii="Calibri" w:cs="Calibri"/>
-        </w:rPr>
-        <w:t>Larkum</w:t>
-      </w:r>
-      <w:proofErr w:type="spellEnd"/>
-      <w:r>
-        <w:rPr>
-          <w:rFonts w:ascii="Calibri" w:cs="Calibri"/>
-        </w:rPr>
-        <w:t xml:space="preserve">, A.W.D., </w:t>
-      </w:r>
-      <w:proofErr w:type="spellStart"/>
-      <w:r>
-        <w:rPr>
-          <w:rFonts w:ascii="Calibri" w:cs="Calibri"/>
-        </w:rPr>
-        <w:t>McComb</w:t>
-      </w:r>
-      <w:proofErr w:type="spellEnd"/>
-      <w:r>
-        <w:rPr>
-          <w:rFonts w:ascii="Calibri" w:cs="Calibri"/>
-        </w:rPr>
-        <w:t xml:space="preserve">, A.J., 1989. Productivity and nutrient limitation, in: </w:t>
-      </w:r>
-      <w:proofErr w:type="spellStart"/>
-      <w:r>
-        <w:rPr>
-          <w:rFonts w:ascii="Calibri" w:cs="Calibri"/>
-        </w:rPr>
-        <w:t>Larkum</w:t>
-      </w:r>
-      <w:proofErr w:type="spellEnd"/>
-      <w:r>
-        <w:rPr>
-          <w:rFonts w:ascii="Calibri" w:cs="Calibri"/>
-        </w:rPr>
-        <w:t xml:space="preserve">, A.W.D., </w:t>
-      </w:r>
-      <w:proofErr w:type="spellStart"/>
-      <w:r>
-        <w:rPr>
-          <w:rFonts w:ascii="Calibri" w:cs="Calibri"/>
-        </w:rPr>
-        <w:t>McComb</w:t>
-      </w:r>
-      <w:proofErr w:type="spellEnd"/>
-      <w:r>
-        <w:rPr>
-          <w:rFonts w:ascii="Calibri" w:cs="Calibri"/>
-        </w:rPr>
-        <w:t xml:space="preserve">, A.J., Shephard, S.A. (Eds.), Biology of </w:t>
-      </w:r>
-      <w:proofErr w:type="gramStart"/>
-      <w:r>
-        <w:rPr>
-          <w:rFonts w:ascii="Calibri" w:cs="Calibri"/>
-        </w:rPr>
-        <w:t>Seagrasses :</w:t>
-      </w:r>
-      <w:proofErr w:type="gramEnd"/>
-      <w:r>
-        <w:rPr>
-          <w:rFonts w:ascii="Calibri" w:cs="Calibri"/>
-        </w:rPr>
-        <w:t xml:space="preserve"> A Treatise on the Biology of Seagrasses with Special Reference to the Australian Region. Elsevier Science Pub., Amsterdam, The Netherlands, pp. 635–685.</w:t>
-      </w:r>
-    </w:p>
-    <w:p>
-      <w:pPr>
-        <w:pStyle w:val="Bibliography"/>
-        <w:rPr>
-          <w:rFonts w:ascii="Calibri" w:cs="Calibri"/>
-        </w:rPr>
-      </w:pPr>
-      <w:r>
-        <w:rPr>
-          <w:rFonts w:ascii="Calibri" w:cs="Calibri"/>
-        </w:rPr>
-        <w:t xml:space="preserve">Jackson, G.A., 1977. Nutrients and Production of Giant Kelp, </w:t>
-      </w:r>
-      <w:proofErr w:type="spellStart"/>
-      <w:r>
-        <w:rPr>
-          <w:rFonts w:ascii="Calibri" w:cs="Calibri"/>
-        </w:rPr>
-        <w:t>Macrocystis</w:t>
-      </w:r>
-      <w:proofErr w:type="spellEnd"/>
-      <w:r>
-        <w:rPr>
-          <w:rFonts w:ascii="Calibri" w:cs="Calibri"/>
-        </w:rPr>
-        <w:t xml:space="preserve"> </w:t>
-      </w:r>
-      <w:proofErr w:type="spellStart"/>
-      <w:r>
-        <w:rPr>
-          <w:rFonts w:ascii="Calibri" w:cs="Calibri"/>
-        </w:rPr>
-        <w:t>pyrifera</w:t>
-      </w:r>
-      <w:proofErr w:type="spellEnd"/>
-      <w:r>
-        <w:rPr>
-          <w:rFonts w:ascii="Calibri" w:cs="Calibri"/>
-        </w:rPr>
-        <w:t>, Off Southern California. Limnology and Oceanography 22, 979–995.</w:t>
-      </w:r>
-    </w:p>
-    <w:p>
-      <w:pPr>
-        <w:pStyle w:val="Bibliography"/>
-        <w:rPr>
-          <w:rFonts w:ascii="Calibri" w:cs="Calibri"/>
-        </w:rPr>
-      </w:pPr>
-      <w:r>
-        <w:rPr>
-          <w:rFonts w:ascii="Calibri" w:cs="Calibri"/>
-        </w:rPr>
-        <w:t xml:space="preserve">McNaughton, S.J., </w:t>
-      </w:r>
-      <w:proofErr w:type="spellStart"/>
-      <w:r>
-        <w:rPr>
-          <w:rFonts w:ascii="Calibri" w:cs="Calibri"/>
-        </w:rPr>
-        <w:t>Ruess</w:t>
-      </w:r>
-      <w:proofErr w:type="spellEnd"/>
-      <w:r>
-        <w:rPr>
-          <w:rFonts w:ascii="Calibri" w:cs="Calibri"/>
-        </w:rPr>
-        <w:t xml:space="preserve">, R.W., </w:t>
-      </w:r>
-      <w:proofErr w:type="spellStart"/>
-      <w:r>
-        <w:rPr>
-          <w:rFonts w:ascii="Calibri" w:cs="Calibri"/>
-        </w:rPr>
-        <w:t>Seagle</w:t>
-      </w:r>
-      <w:proofErr w:type="spellEnd"/>
-      <w:r>
-        <w:rPr>
-          <w:rFonts w:ascii="Calibri" w:cs="Calibri"/>
-        </w:rPr>
-        <w:t xml:space="preserve">, S.W., 1988. Large mammals and process dynamics in African ecosystems. </w:t>
-      </w:r>
-      <w:proofErr w:type="spellStart"/>
-      <w:r>
-        <w:rPr>
-          <w:rFonts w:ascii="Calibri" w:cs="Calibri"/>
-        </w:rPr>
-        <w:t>BioScience</w:t>
-      </w:r>
-      <w:proofErr w:type="spellEnd"/>
-      <w:r>
-        <w:rPr>
-          <w:rFonts w:ascii="Calibri" w:cs="Calibri"/>
-        </w:rPr>
-        <w:t xml:space="preserve"> 38, 794–800. https://doi.org/10.2307/1310789</w:t>
-      </w:r>
-    </w:p>
-    <w:p>
-      <w:pPr>
-        <w:pStyle w:val="Bibliography"/>
-        <w:rPr>
-          <w:rFonts w:ascii="Calibri" w:cs="Calibri"/>
-        </w:rPr>
-      </w:pPr>
-      <w:r>
-        <w:rPr>
-          <w:rFonts w:ascii="Calibri" w:cs="Calibri"/>
-        </w:rPr>
-        <w:t xml:space="preserve">McPhee-Shaw, E.E., Siegel, D.A., Washburn, L., Brzezinski, M.A., Jones, J.L., </w:t>
-      </w:r>
-      <w:proofErr w:type="spellStart"/>
-      <w:r>
-        <w:rPr>
-          <w:rFonts w:ascii="Calibri" w:cs="Calibri"/>
-        </w:rPr>
-        <w:t>Leydecker</w:t>
-      </w:r>
-      <w:proofErr w:type="spellEnd"/>
-      <w:r>
-        <w:rPr>
-          <w:rFonts w:ascii="Calibri" w:cs="Calibri"/>
-        </w:rPr>
-        <w:t xml:space="preserve">, A., </w:t>
-      </w:r>
-      <w:proofErr w:type="spellStart"/>
-      <w:r>
-        <w:rPr>
-          <w:rFonts w:ascii="Calibri" w:cs="Calibri"/>
-        </w:rPr>
-        <w:t>Melack</w:t>
-      </w:r>
-      <w:proofErr w:type="spellEnd"/>
-      <w:r>
-        <w:rPr>
-          <w:rFonts w:ascii="Calibri" w:cs="Calibri"/>
-        </w:rPr>
-        <w:t xml:space="preserve">, J., 2007. Mechanisms for nutrient delivery to the inner shelf: Observations from </w:t>
-      </w:r>
-      <w:r>
-        <w:rPr>
-          <w:rFonts w:ascii="Calibri" w:cs="Calibri"/>
-        </w:rPr>
-        <w:lastRenderedPageBreak/>
-        <w:t>the Santa Barbara Channel. Limnology and Oceanography 52, 1748–1766. https://doi.org/10.4319/lo.2007.52.5.1748</w:t>
-      </w:r>
-    </w:p>
-    <w:p>
-      <w:pPr>
-        <w:pStyle w:val="Bibliography"/>
-        <w:rPr>
-          <w:rFonts w:ascii="Calibri" w:cs="Calibri"/>
-        </w:rPr>
-      </w:pPr>
-      <w:r>
-        <w:rPr>
-          <w:rFonts w:ascii="Calibri" w:cs="Calibri"/>
-        </w:rPr>
-        <w:t xml:space="preserve">Meyer, J.L., Schultz, E.T., </w:t>
-      </w:r>
-      <w:proofErr w:type="spellStart"/>
-      <w:r>
-        <w:rPr>
-          <w:rFonts w:ascii="Calibri" w:cs="Calibri"/>
-        </w:rPr>
-        <w:t>Helfman</w:t>
-      </w:r>
-      <w:proofErr w:type="spellEnd"/>
-      <w:r>
-        <w:rPr>
-          <w:rFonts w:ascii="Calibri" w:cs="Calibri"/>
-        </w:rPr>
-        <w:t>, G.S., 1983. Fish schools: An asset to corals. Science 220, 1047–1049. https://doi.org/10.1126/science.220.4601.1047</w:t>
-      </w:r>
-    </w:p>
-    <w:p>
-      <w:pPr>
-        <w:pStyle w:val="Bibliography"/>
-        <w:rPr>
-          <w:rFonts w:ascii="Calibri" w:cs="Calibri"/>
-        </w:rPr>
-      </w:pPr>
-      <w:r>
-        <w:rPr>
-          <w:rFonts w:ascii="Calibri" w:cs="Calibri"/>
-        </w:rPr>
-        <w:t xml:space="preserve">Moore, C.M., Mills, M.M., Arrigo, K.R., Berman-Frank, I., Bopp, L., Boyd, P.W., Galbraith, E.D., </w:t>
-      </w:r>
-      <w:proofErr w:type="spellStart"/>
-      <w:r>
-        <w:rPr>
-          <w:rFonts w:ascii="Calibri" w:cs="Calibri"/>
-        </w:rPr>
-        <w:t>Geider</w:t>
-      </w:r>
-      <w:proofErr w:type="spellEnd"/>
-      <w:r>
-        <w:rPr>
-          <w:rFonts w:ascii="Calibri" w:cs="Calibri"/>
-        </w:rPr>
-        <w:t xml:space="preserve">, R.J., </w:t>
-      </w:r>
-      <w:proofErr w:type="spellStart"/>
-      <w:r>
-        <w:rPr>
-          <w:rFonts w:ascii="Calibri" w:cs="Calibri"/>
-        </w:rPr>
-        <w:t>Guieu</w:t>
-      </w:r>
-      <w:proofErr w:type="spellEnd"/>
-      <w:r>
-        <w:rPr>
-          <w:rFonts w:ascii="Calibri" w:cs="Calibri"/>
-        </w:rPr>
-        <w:t xml:space="preserve">, C., Jaccard, S.L., </w:t>
-      </w:r>
-      <w:proofErr w:type="spellStart"/>
-      <w:r>
-        <w:rPr>
-          <w:rFonts w:ascii="Calibri" w:cs="Calibri"/>
-        </w:rPr>
-        <w:t>Jickells</w:t>
-      </w:r>
-      <w:proofErr w:type="spellEnd"/>
-      <w:r>
-        <w:rPr>
-          <w:rFonts w:ascii="Calibri" w:cs="Calibri"/>
-        </w:rPr>
-        <w:t xml:space="preserve">, T.D., La Roche, J., </w:t>
-      </w:r>
-      <w:proofErr w:type="spellStart"/>
-      <w:r>
-        <w:rPr>
-          <w:rFonts w:ascii="Calibri" w:cs="Calibri"/>
-        </w:rPr>
-        <w:t>Lenton</w:t>
-      </w:r>
-      <w:proofErr w:type="spellEnd"/>
-      <w:r>
-        <w:rPr>
-          <w:rFonts w:ascii="Calibri" w:cs="Calibri"/>
-        </w:rPr>
-        <w:t xml:space="preserve">, T.M., </w:t>
-      </w:r>
-      <w:proofErr w:type="spellStart"/>
-      <w:r>
-        <w:rPr>
-          <w:rFonts w:ascii="Calibri" w:cs="Calibri"/>
-        </w:rPr>
-        <w:t>Mahowald</w:t>
-      </w:r>
-      <w:proofErr w:type="spellEnd"/>
-      <w:r>
-        <w:rPr>
-          <w:rFonts w:ascii="Calibri" w:cs="Calibri"/>
-        </w:rPr>
-        <w:t xml:space="preserve">, N.M., </w:t>
-      </w:r>
-      <w:proofErr w:type="spellStart"/>
-      <w:r>
-        <w:rPr>
-          <w:rFonts w:ascii="Calibri" w:cs="Calibri"/>
-        </w:rPr>
-        <w:t>Marañón</w:t>
-      </w:r>
-      <w:proofErr w:type="spellEnd"/>
-      <w:r>
-        <w:rPr>
-          <w:rFonts w:ascii="Calibri" w:cs="Calibri"/>
-        </w:rPr>
-        <w:t xml:space="preserve">, E., </w:t>
-      </w:r>
-      <w:proofErr w:type="spellStart"/>
-      <w:r>
-        <w:rPr>
-          <w:rFonts w:ascii="Calibri" w:cs="Calibri"/>
-        </w:rPr>
-        <w:t>Marinov</w:t>
-      </w:r>
-      <w:proofErr w:type="spellEnd"/>
-      <w:r>
-        <w:rPr>
-          <w:rFonts w:ascii="Calibri" w:cs="Calibri"/>
-        </w:rPr>
-        <w:t xml:space="preserve">, I., Moore, J.K., Nakatsuka, T., </w:t>
-      </w:r>
-      <w:proofErr w:type="spellStart"/>
-      <w:r>
-        <w:rPr>
-          <w:rFonts w:ascii="Calibri" w:cs="Calibri"/>
-        </w:rPr>
-        <w:t>Oschlies</w:t>
-      </w:r>
-      <w:proofErr w:type="spellEnd"/>
-      <w:r>
-        <w:rPr>
-          <w:rFonts w:ascii="Calibri" w:cs="Calibri"/>
-        </w:rPr>
-        <w:t xml:space="preserve">, A., Saito, M.A., </w:t>
-      </w:r>
-      <w:proofErr w:type="spellStart"/>
-      <w:r>
-        <w:rPr>
-          <w:rFonts w:ascii="Calibri" w:cs="Calibri"/>
-        </w:rPr>
-        <w:t>Thingstad</w:t>
-      </w:r>
-      <w:proofErr w:type="spellEnd"/>
-      <w:r>
-        <w:rPr>
-          <w:rFonts w:ascii="Calibri" w:cs="Calibri"/>
-        </w:rPr>
-        <w:t>, T.F., Tsuda, A., Ulloa, O., 2013. Processes and patterns of oceanic nutrient limitation. Nature Geoscience 6, 701–710. https://doi.org/10.1038/ngeo1765</w:t>
-      </w:r>
-    </w:p>
-    <w:p>
-      <w:pPr>
-        <w:pStyle w:val="Bibliography"/>
-        <w:rPr>
-          <w:rFonts w:ascii="Calibri" w:cs="Calibri"/>
-        </w:rPr>
-      </w:pPr>
-      <w:r>
-        <w:rPr>
-          <w:rFonts w:ascii="Calibri" w:cs="Calibri"/>
-        </w:rPr>
-        <w:t>Peterson, B., Heck, K., 2001. Positive interactions between suspension-feeding bivalves and seagrass-a facultative mutualism. Mar. Ecol. Prog. Ser. 213, 143–155. https://doi.org/10.3354/meps213143</w:t>
-      </w:r>
-    </w:p>
-    <w:p>
-      <w:pPr>
-        <w:pStyle w:val="Bibliography"/>
-        <w:rPr>
-          <w:rFonts w:ascii="Calibri" w:cs="Calibri"/>
-        </w:rPr>
-      </w:pPr>
-      <w:r>
-        <w:rPr>
-          <w:rFonts w:ascii="Calibri" w:cs="Calibri"/>
-        </w:rPr>
-        <w:t xml:space="preserve">Pfister, C.A., </w:t>
-      </w:r>
-      <w:proofErr w:type="spellStart"/>
-      <w:r>
-        <w:rPr>
-          <w:rFonts w:ascii="Calibri" w:cs="Calibri"/>
-        </w:rPr>
-        <w:t>Altabet</w:t>
-      </w:r>
-      <w:proofErr w:type="spellEnd"/>
-      <w:r>
-        <w:rPr>
-          <w:rFonts w:ascii="Calibri" w:cs="Calibri"/>
-        </w:rPr>
-        <w:t>, M.A., Post, D., 2014. Animal regeneration and microbial retention of nitrogen along coastal rocky shores. Ecology 95, 2803–2814. https://doi.org/10.1890/13-1825.1</w:t>
-      </w:r>
-    </w:p>
-    <w:p>
-      <w:pPr>
-        <w:pStyle w:val="Bibliography"/>
-        <w:rPr>
-          <w:rFonts w:ascii="Calibri" w:cs="Calibri"/>
-        </w:rPr>
-      </w:pPr>
-      <w:r>
-        <w:rPr>
-          <w:rFonts w:ascii="Calibri" w:cs="Calibri"/>
-        </w:rPr>
-        <w:t>Phillips, J.C., Hurd, C.L., 2004. Kinetics of nitrate, ammonium, and urea uptake by four intertidal seaweeds from New Zealand. Journal of Phycology 40, 534–545. https://doi.org/10.1111/j.1529-8817.2004.03157.x</w:t>
-      </w:r>
-    </w:p>
-    <w:p>
-      <w:pPr>
-        <w:pStyle w:val="Bibliography"/>
-        <w:rPr>
-          <w:rFonts w:ascii="Calibri" w:cs="Calibri"/>
-        </w:rPr>
-      </w:pPr>
-      <w:proofErr w:type="spellStart"/>
-      <w:r>
-        <w:rPr>
-          <w:rFonts w:ascii="Calibri" w:cs="Calibri"/>
-        </w:rPr>
-        <w:t>Probyn</w:t>
-      </w:r>
-      <w:proofErr w:type="spellEnd"/>
-      <w:r>
-        <w:rPr>
-          <w:rFonts w:ascii="Calibri" w:cs="Calibri"/>
-        </w:rPr>
-        <w:t>, T.A., McQuaid, C.D., 1985. In-situ measurements of nitrogenous nutrient uptake by kelp (</w:t>
-      </w:r>
-      <w:proofErr w:type="spellStart"/>
-      <w:r>
-        <w:rPr>
-          <w:rFonts w:ascii="Calibri" w:cs="Calibri"/>
-        </w:rPr>
-        <w:t>Ecklonia</w:t>
-      </w:r>
-      <w:proofErr w:type="spellEnd"/>
-      <w:r>
-        <w:rPr>
-          <w:rFonts w:ascii="Calibri" w:cs="Calibri"/>
-        </w:rPr>
-        <w:t xml:space="preserve"> maxima) and phytoplankton in a nitrate-rich upwelling environment. Mar. Biol. 88, 149–154. https://doi.org/10.1007/BF00397162</w:t>
-      </w:r>
-    </w:p>
-    <w:p>
-      <w:pPr>
-        <w:pStyle w:val="Bibliography"/>
-        <w:rPr>
-          <w:rFonts w:ascii="Calibri" w:cs="Calibri"/>
-        </w:rPr>
-      </w:pPr>
-      <w:proofErr w:type="spellStart"/>
-      <w:r>
-        <w:rPr>
-          <w:rFonts w:ascii="Calibri" w:cs="Calibri"/>
-        </w:rPr>
-        <w:t>Ryther</w:t>
-      </w:r>
-      <w:proofErr w:type="spellEnd"/>
-      <w:r>
-        <w:rPr>
-          <w:rFonts w:ascii="Calibri" w:cs="Calibri"/>
-        </w:rPr>
-        <w:t>, J.H., Dunstan, W.M., 1971. Nitrogen, phosphorus, and eutrophication in the coastal marine environment. Science 171, 1008–1013. https://doi.org/10.1126/science.171.3975.1008</w:t>
-      </w:r>
-    </w:p>
-    <w:p>
-      <w:pPr>
-        <w:pStyle w:val="Bibliography"/>
-        <w:rPr>
-          <w:rFonts w:ascii="Calibri" w:cs="Calibri"/>
-        </w:rPr>
-      </w:pPr>
-      <w:r>
-        <w:rPr>
-          <w:rFonts w:ascii="Calibri" w:cs="Calibri"/>
-        </w:rPr>
-        <w:t>Schindler, D.W., 1974. Eutrophication and Recovery in Experimental Lakes: Implications for Lake Management. Science 184, 897–899. https://doi.org/10.1126/science.184.4139.897</w:t>
-      </w:r>
-    </w:p>
-    <w:p>
-      <w:pPr>
-        <w:pStyle w:val="Bibliography"/>
-        <w:rPr>
-          <w:rFonts w:ascii="Calibri" w:cs="Calibri"/>
-        </w:rPr>
-      </w:pPr>
-      <w:r>
-        <w:rPr>
-          <w:rFonts w:ascii="Calibri" w:cs="Calibri"/>
-        </w:rPr>
-        <w:t xml:space="preserve">Sitters, J., Bakker, E.S., Veldhuis, M.P., Veen, G.F., </w:t>
-      </w:r>
-      <w:proofErr w:type="spellStart"/>
-      <w:r>
-        <w:rPr>
-          <w:rFonts w:ascii="Calibri" w:cs="Calibri"/>
-        </w:rPr>
-        <w:t>Olde</w:t>
-      </w:r>
-      <w:proofErr w:type="spellEnd"/>
-      <w:r>
-        <w:rPr>
-          <w:rFonts w:ascii="Calibri" w:cs="Calibri"/>
-        </w:rPr>
-        <w:t xml:space="preserve"> </w:t>
-      </w:r>
-      <w:proofErr w:type="spellStart"/>
-      <w:r>
-        <w:rPr>
-          <w:rFonts w:ascii="Calibri" w:cs="Calibri"/>
-        </w:rPr>
-        <w:t>Venterink</w:t>
-      </w:r>
-      <w:proofErr w:type="spellEnd"/>
-      <w:r>
-        <w:rPr>
-          <w:rFonts w:ascii="Calibri" w:cs="Calibri"/>
-        </w:rPr>
-        <w:t xml:space="preserve">, H., </w:t>
-      </w:r>
-      <w:proofErr w:type="spellStart"/>
-      <w:r>
-        <w:rPr>
-          <w:rFonts w:ascii="Calibri" w:cs="Calibri"/>
-        </w:rPr>
-        <w:t>Vanni</w:t>
-      </w:r>
-      <w:proofErr w:type="spellEnd"/>
-      <w:r>
-        <w:rPr>
-          <w:rFonts w:ascii="Calibri" w:cs="Calibri"/>
-        </w:rPr>
-        <w:t>, M.J., 2017. The stoichiometry of nutrient release by terrestrial herbivores and its ecosystem consequences. Front. Earth Sci. 5. https://doi.org/10.3389/feart.2017.00032</w:t>
-      </w:r>
-    </w:p>
-    <w:p>
-      <w:pPr>
-        <w:pStyle w:val="Bibliography"/>
-        <w:rPr>
-          <w:rFonts w:ascii="Calibri" w:cs="Calibri"/>
-        </w:rPr>
-      </w:pPr>
-      <w:r>
-        <w:rPr>
-          <w:rFonts w:ascii="Calibri" w:cs="Calibri"/>
-        </w:rPr>
-        <w:t>Smith, V.H., Tilman, G.D., Nekola, J.C., 1999. Eutrophication: impacts of excess nutrient inputs on freshwater, marine, and terrestrial ecosystems. Environmental Pollution 100, 179–196. https://doi.org/10.1016/S0269-7491(99)00091-3</w:t>
-      </w:r>
-    </w:p>
-    <w:p>
-      <w:pPr>
-        <w:pStyle w:val="Bibliography"/>
-        <w:rPr>
-          <w:rFonts w:ascii="Calibri" w:cs="Calibri"/>
-        </w:rPr>
-      </w:pPr>
-      <w:proofErr w:type="spellStart"/>
-      <w:r>
-        <w:rPr>
-          <w:rFonts w:ascii="Calibri" w:cs="Calibri"/>
-        </w:rPr>
-        <w:t>Vanni</w:t>
-      </w:r>
-      <w:proofErr w:type="spellEnd"/>
-      <w:r>
-        <w:rPr>
-          <w:rFonts w:ascii="Calibri" w:cs="Calibri"/>
-        </w:rPr>
-        <w:t>, M.J., 2002. Nutrient cycling by animals in freshwater ecosystems. Annual Review of Ecology and Systematics 33, 341–370. https://doi.org/10.1146/annurev.ecolsys.33.010802.150519</w:t>
-      </w:r>
-    </w:p>
-    <w:p>
-      <w:pPr>
-        <w:pStyle w:val="Bibliography"/>
-        <w:rPr>
-          <w:rFonts w:ascii="Calibri" w:cs="Calibri"/>
-        </w:rPr>
-      </w:pPr>
-      <w:proofErr w:type="spellStart"/>
-      <w:r>
-        <w:rPr>
-          <w:rFonts w:ascii="Calibri" w:cs="Calibri"/>
-        </w:rPr>
-        <w:t>Viechtbauer</w:t>
-      </w:r>
-      <w:proofErr w:type="spellEnd"/>
-      <w:r>
-        <w:rPr>
-          <w:rFonts w:ascii="Calibri" w:cs="Calibri"/>
-        </w:rPr>
-        <w:t xml:space="preserve">, W., 2010. Conducting Meta-Analyses in </w:t>
+        <w:t xml:space="preserve">Viechtbauer, W., 2010. Conducting Meta-Analyses in </w:t>
       </w:r>
       <w:r>
         <w:rPr>
@@ -7704,7 +8731,6 @@
         </w:rPr>
         <w:t xml:space="preserve"> with the </w:t>
       </w:r>
-      <w:proofErr w:type="spellStart"/>
       <w:r>
         <w:rPr>
           <w:rFonts w:ascii="Calibri" w:cs="Calibri"/>
@@ -7713,7 +8739,6 @@
         </w:rPr>
         <w:t>metafor</w:t>
       </w:r>
-      <w:proofErr w:type="spellEnd"/>
       <w:r>
         <w:rPr>
           <w:rFonts w:ascii="Calibri" w:cs="Calibri"/>
@@ -7916,7 +8941,7 @@
       </w:r>
     </w:p>
   </w:comment>
-  <w:comment w:id="8" w:author="Em Lim" w:date="2023-01-18T10:00:00Z" w:initials="EL">
+  <w:comment w:id="8" w:author="Em Lim" w:date="2023-01-20T10:43:00Z" w:initials="EL">
     <w:p>
       <w:pPr>
         <w:pStyle w:val="CommentText"/>
@@ -7928,11 +8953,27 @@
         <w:annotationRef/>
       </w:r>
       <w:r>
+        <w:t>37 or 38?</w:t>
+      </w:r>
+    </w:p>
+  </w:comment>
+  <w:comment w:id="9" w:author="Em Lim" w:date="2023-01-18T10:00:00Z" w:initials="EL">
+    <w:p>
+      <w:pPr>
+        <w:pStyle w:val="CommentText"/>
+      </w:pPr>
+      <w:r>
+        <w:rPr>
+          <w:rStyle w:val="CommentReference"/>
+        </w:rPr>
+        <w:annotationRef/>
+      </w:r>
+      <w:r>
         <w:t>Provide justification for this and an explanation of what species were included in each!</w:t>
       </w:r>
     </w:p>
   </w:comment>
-  <w:comment w:id="9" w:author="Em Lim" w:date="2023-01-18T11:19:00Z" w:initials="EL">
+  <w:comment w:id="10" w:author="Em Lim" w:date="2023-01-18T11:19:00Z" w:initials="EL">
     <w:p>
       <w:pPr>
         <w:pStyle w:val="CommentText"/>
@@ -7953,6 +8994,22 @@
       <w:proofErr w:type="gramEnd"/>
       <w:r>
         <w:t xml:space="preserve"> τ 2 = 0 in random- and mixed-effects models can be tested with Cochran’s Q-test</w:t>
+      </w:r>
+    </w:p>
+  </w:comment>
+  <w:comment w:id="11" w:author="Em Lim" w:date="2023-01-19T13:19:00Z" w:initials="EL">
+    <w:p>
+      <w:pPr>
+        <w:pStyle w:val="CommentText"/>
+      </w:pPr>
+      <w:r>
+        <w:rPr>
+          <w:rStyle w:val="CommentReference"/>
+        </w:rPr>
+        <w:annotationRef/>
+      </w:r>
+      <w:r>
+        <w:t>Dude I still don’t know how to interpret these….</w:t>
       </w:r>
     </w:p>
   </w:comment>
@@ -7969,8 +9026,10 @@
   <w15:commentEx w15:paraId="2AD432BF" w15:done="0"/>
   <w15:commentEx w15:paraId="155D925E" w15:done="0"/>
   <w15:commentEx w15:paraId="419ED5B5" w15:done="0"/>
+  <w15:commentEx w15:paraId="13A7D497" w15:done="0"/>
   <w15:commentEx w15:paraId="18FFDB0E" w15:done="0"/>
   <w15:commentEx w15:paraId="56C7399E" w15:done="0"/>
+  <w15:commentEx w15:paraId="113FB20D" w15:done="0"/>
 </w15:commentsEx>
 </file>
 
@@ -8005,8 +9064,10 @@
   <w16cid:commentId w16cid:paraId="2AD432BF" w16cid:durableId="2593BBA3"/>
   <w16cid:commentId w16cid:paraId="155D925E" w16cid:durableId="22F8AC9D"/>
   <w16cid:commentId w16cid:paraId="419ED5B5" w16cid:durableId="2593BBB0"/>
+  <w16cid:commentId w16cid:paraId="13A7D497" w16cid:durableId="2774EEBE"/>
   <w16cid:commentId w16cid:paraId="18FFDB0E" w16cid:durableId="277241D1"/>
   <w16cid:commentId w16cid:paraId="56C7399E" w16cid:durableId="27725442"/>
+  <w16cid:commentId w16cid:paraId="113FB20D" w16cid:durableId="2773C1F8"/>
 </w16cid:commentsIds>
 </file>
 

</xml_diff>